<commit_message>
Podglad PDF w modalu + justowanie akapitow (text-align-last left, hyphens)
</commit_message>
<xml_diff>
--- a/dist/research-OC-dentysty.docx
+++ b/dist/research-OC-dentysty.docx
@@ -1,6 +1,6 @@
 
 <file path=word/document.xml><?xml version="1.0" encoding="utf-8"?>
-<w:document xmlns:o="urn:schemas-microsoft-com:office:office" xmlns:r="http://schemas.openxmlformats.org/officeDocument/2006/relationships" xmlns:v="urn:schemas-microsoft-com:vml" xmlns:w="http://schemas.openxmlformats.org/wordprocessingml/2006/main" xmlns:w10="urn:schemas-microsoft-com:office:word" xmlns:wp="http://schemas.openxmlformats.org/drawingml/2006/wordprocessingDrawing" xmlns:wps="http://schemas.microsoft.com/office/word/2010/wordprocessingShape" xmlns:wpg="http://schemas.microsoft.com/office/word/2010/wordprocessingGroup" xmlns:mc="http://schemas.openxmlformats.org/markup-compatibility/2006" xmlns:wp14="http://schemas.microsoft.com/office/word/2010/wordprocessingDrawing" xmlns:w14="http://schemas.microsoft.com/office/word/2010/wordml" xmlns:w15="http://schemas.microsoft.com/office/word/2012/wordml" mc:Ignorable="w14 wp14 w15">
+<w:document xmlns:o="urn:schemas-microsoft-com:office:office" xmlns:r="http://schemas.openxmlformats.org/officeDocument/2006/relationships" xmlns:v="urn:schemas-microsoft-com:vml" xmlns:w="http://schemas.openxmlformats.org/wordprocessingml/2006/main" xmlns:w10="urn:schemas-microsoft-com:office:word" xmlns:wp="http://schemas.openxmlformats.org/drawingml/2006/wordprocessingDrawing" xmlns:pic="http://schemas.openxmlformats.org/drawingml/2006/picture" xmlns:wps="http://schemas.microsoft.com/office/word/2010/wordprocessingShape" xmlns:wpg="http://schemas.microsoft.com/office/word/2010/wordprocessingGroup" xmlns:mc="http://schemas.openxmlformats.org/markup-compatibility/2006" xmlns:wp14="http://schemas.microsoft.com/office/word/2010/wordprocessingDrawing" xmlns:w14="http://schemas.microsoft.com/office/word/2010/wordml" xmlns:w15="http://schemas.microsoft.com/office/word/2012/wordml" mc:Ignorable="w14 wp14 w15">
   <w:body>
     <w:p>
       <w:pPr>
@@ -62,6 +62,7 @@
         <w:bidi w:val="0"/>
         <w:spacing w:before="90" w:after="0"/>
         <w:ind w:hanging="283" w:start="709"/>
+        <w:jc w:val="start"/>
         <w:rPr/>
       </w:pPr>
       <w:r>
@@ -89,6 +90,7 @@
         <w:bidi w:val="0"/>
         <w:spacing w:before="90" w:after="0"/>
         <w:ind w:hanging="283" w:start="709"/>
+        <w:jc w:val="start"/>
         <w:rPr/>
       </w:pPr>
       <w:r>
@@ -116,6 +118,7 @@
         <w:bidi w:val="0"/>
         <w:spacing w:before="90" w:after="0"/>
         <w:ind w:hanging="283" w:start="709"/>
+        <w:jc w:val="start"/>
         <w:rPr/>
       </w:pPr>
       <w:r>
@@ -142,6 +145,7 @@
         </w:tabs>
         <w:bidi w:val="0"/>
         <w:ind w:hanging="283" w:start="709"/>
+        <w:jc w:val="start"/>
         <w:rPr/>
       </w:pPr>
       <w:r>
@@ -192,6 +196,7 @@
         <w:bidi w:val="0"/>
         <w:spacing w:before="90" w:after="0"/>
         <w:ind w:hanging="283" w:start="709"/>
+        <w:jc w:val="start"/>
         <w:rPr/>
       </w:pPr>
       <w:r>
@@ -219,6 +224,7 @@
         <w:bidi w:val="0"/>
         <w:spacing w:before="90" w:after="0"/>
         <w:ind w:hanging="283" w:start="709"/>
+        <w:jc w:val="start"/>
         <w:rPr/>
       </w:pPr>
       <w:r>
@@ -256,6 +262,7 @@
         <w:bidi w:val="0"/>
         <w:spacing w:before="90" w:after="0"/>
         <w:ind w:hanging="283" w:start="709"/>
+        <w:jc w:val="start"/>
         <w:rPr/>
       </w:pPr>
       <w:r>
@@ -303,6 +310,7 @@
         <w:bidi w:val="0"/>
         <w:spacing w:before="90" w:after="0"/>
         <w:ind w:hanging="283" w:start="709"/>
+        <w:jc w:val="start"/>
         <w:rPr/>
       </w:pPr>
       <w:r>
@@ -342,6 +350,7 @@
         <w:bidi w:val="0"/>
         <w:spacing w:before="90" w:after="0"/>
         <w:ind w:hanging="283" w:start="709"/>
+        <w:jc w:val="start"/>
         <w:rPr/>
       </w:pPr>
       <w:r>
@@ -369,6 +378,7 @@
         <w:bidi w:val="0"/>
         <w:spacing w:before="90" w:after="0"/>
         <w:ind w:hanging="283" w:start="709"/>
+        <w:jc w:val="start"/>
         <w:rPr/>
       </w:pPr>
       <w:r>
@@ -406,6 +416,7 @@
         <w:bidi w:val="0"/>
         <w:spacing w:before="90" w:after="0"/>
         <w:ind w:hanging="283" w:start="709"/>
+        <w:jc w:val="start"/>
         <w:rPr/>
       </w:pPr>
       <w:r>
@@ -433,6 +444,7 @@
         <w:bidi w:val="0"/>
         <w:spacing w:before="90" w:after="0"/>
         <w:ind w:hanging="283" w:start="709"/>
+        <w:jc w:val="start"/>
         <w:rPr/>
       </w:pPr>
       <w:r>
@@ -470,6 +482,7 @@
         <w:bidi w:val="0"/>
         <w:spacing w:before="90" w:after="0"/>
         <w:ind w:hanging="283" w:start="709"/>
+        <w:jc w:val="start"/>
         <w:rPr/>
       </w:pPr>
       <w:r>
@@ -496,6 +509,7 @@
         </w:tabs>
         <w:bidi w:val="0"/>
         <w:ind w:hanging="283" w:start="709"/>
+        <w:jc w:val="start"/>
         <w:rPr/>
       </w:pPr>
       <w:r>
@@ -556,6 +570,7 @@
         <w:bidi w:val="0"/>
         <w:spacing w:before="90" w:after="0"/>
         <w:ind w:hanging="283" w:start="709"/>
+        <w:jc w:val="start"/>
         <w:rPr/>
       </w:pPr>
       <w:r>
@@ -583,6 +598,7 @@
         <w:bidi w:val="0"/>
         <w:spacing w:before="90" w:after="0"/>
         <w:ind w:hanging="283" w:start="709"/>
+        <w:jc w:val="start"/>
         <w:rPr/>
       </w:pPr>
       <w:r>
@@ -620,6 +636,7 @@
         <w:bidi w:val="0"/>
         <w:spacing w:before="90" w:after="0"/>
         <w:ind w:hanging="283" w:start="709"/>
+        <w:jc w:val="start"/>
         <w:rPr/>
       </w:pPr>
       <w:r>
@@ -646,6 +663,7 @@
         </w:tabs>
         <w:bidi w:val="0"/>
         <w:ind w:hanging="283" w:start="709"/>
+        <w:jc w:val="start"/>
         <w:rPr/>
       </w:pPr>
       <w:r>
@@ -718,6 +736,7 @@
         <w:bidi w:val="0"/>
         <w:spacing w:before="90" w:after="0"/>
         <w:ind w:hanging="283" w:start="709"/>
+        <w:jc w:val="start"/>
         <w:rPr/>
       </w:pPr>
       <w:r>
@@ -745,6 +764,7 @@
         <w:bidi w:val="0"/>
         <w:spacing w:before="90" w:after="0"/>
         <w:ind w:hanging="283" w:start="709"/>
+        <w:jc w:val="start"/>
         <w:rPr/>
       </w:pPr>
       <w:r>
@@ -772,6 +792,7 @@
         <w:bidi w:val="0"/>
         <w:spacing w:before="90" w:after="0"/>
         <w:ind w:hanging="283" w:start="709"/>
+        <w:jc w:val="start"/>
         <w:rPr/>
       </w:pPr>
       <w:r>
@@ -798,6 +819,7 @@
         </w:tabs>
         <w:bidi w:val="0"/>
         <w:ind w:hanging="283" w:start="709"/>
+        <w:jc w:val="start"/>
         <w:rPr/>
       </w:pPr>
       <w:r>
@@ -836,6 +858,7 @@
         </w:tabs>
         <w:bidi w:val="0"/>
         <w:ind w:hanging="283" w:start="709"/>
+        <w:jc w:val="start"/>
         <w:rPr/>
       </w:pPr>
       <w:r>
@@ -869,6 +892,7 @@
         <w:bidi w:val="0"/>
         <w:spacing w:before="90" w:after="0"/>
         <w:ind w:hanging="283" w:start="709"/>
+        <w:jc w:val="start"/>
         <w:rPr/>
       </w:pPr>
       <w:r>
@@ -890,6 +914,7 @@
         <w:bidi w:val="0"/>
         <w:spacing w:before="90" w:after="0"/>
         <w:ind w:hanging="283" w:start="709"/>
+        <w:jc w:val="start"/>
         <w:rPr/>
       </w:pPr>
       <w:r>
@@ -911,6 +936,7 @@
         <w:bidi w:val="0"/>
         <w:spacing w:before="90" w:after="0"/>
         <w:ind w:hanging="283" w:start="709"/>
+        <w:jc w:val="start"/>
         <w:rPr/>
       </w:pPr>
       <w:r>
@@ -932,6 +958,7 @@
         <w:bidi w:val="0"/>
         <w:spacing w:before="90" w:after="0"/>
         <w:ind w:hanging="283" w:start="709"/>
+        <w:jc w:val="start"/>
         <w:rPr/>
       </w:pPr>
       <w:r>
@@ -952,6 +979,7 @@
         </w:tabs>
         <w:bidi w:val="0"/>
         <w:ind w:hanging="283" w:start="709"/>
+        <w:jc w:val="start"/>
         <w:rPr/>
       </w:pPr>
       <w:r>
@@ -985,6 +1013,7 @@
         <w:bidi w:val="0"/>
         <w:spacing w:before="90" w:after="0"/>
         <w:ind w:hanging="283" w:start="709"/>
+        <w:jc w:val="start"/>
         <w:rPr/>
       </w:pPr>
       <w:r>
@@ -1005,6 +1034,7 @@
         </w:tabs>
         <w:bidi w:val="0"/>
         <w:ind w:hanging="283" w:start="709"/>
+        <w:jc w:val="start"/>
         <w:rPr/>
       </w:pPr>
       <w:r>
@@ -1038,6 +1068,7 @@
         <w:bidi w:val="0"/>
         <w:spacing w:before="90" w:after="0"/>
         <w:ind w:hanging="283" w:start="709"/>
+        <w:jc w:val="start"/>
         <w:rPr/>
       </w:pPr>
       <w:r>
@@ -1059,6 +1090,7 @@
         <w:bidi w:val="0"/>
         <w:spacing w:before="90" w:after="90"/>
         <w:ind w:hanging="283" w:start="709"/>
+        <w:jc w:val="start"/>
         <w:rPr/>
       </w:pPr>
       <w:r>
@@ -2164,7 +2196,7 @@
       <w:start w:val="1"/>
       <w:numFmt w:val="none"/>
       <w:suff w:val="nothing"/>
-      <w:lvlText w:val="%1"/>
+      <w:lvlText w:val=""/>
       <w:lvlJc w:val="start"/>
       <w:pPr>
         <w:tabs>
@@ -2175,10 +2207,37 @@
     </w:lvl>
     <w:lvl w:ilvl="1">
       <w:start w:val="1"/>
+      <w:numFmt w:val="none"/>
       <w:pStyle w:val="Heading2"/>
+      <w:suff w:val="nothing"/>
+      <w:lvlText w:val=""/>
+      <w:lvlJc w:val="start"/>
+      <w:pPr>
+        <w:tabs>
+          <w:tab w:val="num" w:pos="0"/>
+        </w:tabs>
+        <w:ind w:start="0" w:hanging="0"/>
+      </w:pPr>
+    </w:lvl>
+    <w:lvl w:ilvl="2">
+      <w:start w:val="1"/>
+      <w:numFmt w:val="none"/>
+      <w:pStyle w:val="Heading3"/>
+      <w:suff w:val="nothing"/>
+      <w:lvlText w:val=""/>
+      <w:lvlJc w:val="start"/>
+      <w:pPr>
+        <w:tabs>
+          <w:tab w:val="num" w:pos="0"/>
+        </w:tabs>
+        <w:ind w:start="0" w:hanging="0"/>
+      </w:pPr>
+    </w:lvl>
+    <w:lvl w:ilvl="3">
+      <w:start w:val="1"/>
       <w:numFmt w:val="none"/>
       <w:suff w:val="nothing"/>
-      <w:lvlText w:val="%2"/>
+      <w:lvlText w:val=""/>
       <w:lvlJc w:val="start"/>
       <w:pPr>
         <w:tabs>
@@ -2187,12 +2246,11 @@
         <w:ind w:start="0" w:hanging="0"/>
       </w:pPr>
     </w:lvl>
-    <w:lvl w:ilvl="2">
-      <w:start w:val="1"/>
-      <w:pStyle w:val="Heading3"/>
+    <w:lvl w:ilvl="4">
+      <w:start w:val="1"/>
       <w:numFmt w:val="none"/>
       <w:suff w:val="nothing"/>
-      <w:lvlText w:val="%3"/>
+      <w:lvlText w:val=""/>
       <w:lvlJc w:val="start"/>
       <w:pPr>
         <w:tabs>
@@ -2201,11 +2259,11 @@
         <w:ind w:start="0" w:hanging="0"/>
       </w:pPr>
     </w:lvl>
-    <w:lvl w:ilvl="3">
+    <w:lvl w:ilvl="5">
       <w:start w:val="1"/>
       <w:numFmt w:val="none"/>
       <w:suff w:val="nothing"/>
-      <w:lvlText w:val="%4"/>
+      <w:lvlText w:val=""/>
       <w:lvlJc w:val="start"/>
       <w:pPr>
         <w:tabs>
@@ -2214,11 +2272,11 @@
         <w:ind w:start="0" w:hanging="0"/>
       </w:pPr>
     </w:lvl>
-    <w:lvl w:ilvl="4">
+    <w:lvl w:ilvl="6">
       <w:start w:val="1"/>
       <w:numFmt w:val="none"/>
       <w:suff w:val="nothing"/>
-      <w:lvlText w:val="%5"/>
+      <w:lvlText w:val=""/>
       <w:lvlJc w:val="start"/>
       <w:pPr>
         <w:tabs>
@@ -2227,11 +2285,11 @@
         <w:ind w:start="0" w:hanging="0"/>
       </w:pPr>
     </w:lvl>
-    <w:lvl w:ilvl="5">
+    <w:lvl w:ilvl="7">
       <w:start w:val="1"/>
       <w:numFmt w:val="none"/>
       <w:suff w:val="nothing"/>
-      <w:lvlText w:val="%6"/>
+      <w:lvlText w:val=""/>
       <w:lvlJc w:val="start"/>
       <w:pPr>
         <w:tabs>
@@ -2240,37 +2298,11 @@
         <w:ind w:start="0" w:hanging="0"/>
       </w:pPr>
     </w:lvl>
-    <w:lvl w:ilvl="6">
+    <w:lvl w:ilvl="8">
       <w:start w:val="1"/>
       <w:numFmt w:val="none"/>
       <w:suff w:val="nothing"/>
-      <w:lvlText w:val="%7"/>
-      <w:lvlJc w:val="start"/>
-      <w:pPr>
-        <w:tabs>
-          <w:tab w:val="num" w:pos="0"/>
-        </w:tabs>
-        <w:ind w:start="0" w:hanging="0"/>
-      </w:pPr>
-    </w:lvl>
-    <w:lvl w:ilvl="7">
-      <w:start w:val="1"/>
-      <w:numFmt w:val="none"/>
-      <w:suff w:val="nothing"/>
-      <w:lvlText w:val="%8"/>
-      <w:lvlJc w:val="start"/>
-      <w:pPr>
-        <w:tabs>
-          <w:tab w:val="num" w:pos="0"/>
-        </w:tabs>
-        <w:ind w:start="0" w:hanging="0"/>
-      </w:pPr>
-    </w:lvl>
-    <w:lvl w:ilvl="8">
-      <w:start w:val="1"/>
-      <w:numFmt w:val="none"/>
-      <w:suff w:val="nothing"/>
-      <w:lvlText w:val="%9"/>
+      <w:lvlText w:val=""/>
       <w:lvlJc w:val="start"/>
       <w:pPr>
         <w:tabs>
@@ -2315,10 +2347,10 @@
   <w:docDefaults>
     <w:rPrDefault>
       <w:rPr>
-        <w:rFonts w:ascii="Liberation Serif" w:hAnsi="Liberation Serif" w:eastAsia="Noto Sans" w:cs="Noto Sans Devanagari"/>
+        <w:rFonts w:ascii="Liberation Serif" w:hAnsi="Liberation Serif" w:eastAsia="Noto Serif CJK SC" w:cs="Noto Sans Devanagari"/>
         <w:sz w:val="24"/>
         <w:szCs w:val="24"/>
-        <w:lang w:val="en-US" w:eastAsia="zh-CN" w:bidi="hi-IN"/>
+        <w:lang w:val="pl-PL" w:eastAsia="zh-CN" w:bidi="hi-IN"/>
       </w:rPr>
     </w:rPrDefault>
     <w:pPrDefault>
@@ -2340,11 +2372,11 @@
       <w:color w:val="111111"/>
       <w:sz w:val="21"/>
       <w:szCs w:val="21"/>
-      <w:lang w:val="en-US" w:eastAsia="zh-CN" w:bidi="hi-IN"/>
+      <w:lang w:val="pl-PL" w:eastAsia="zh-CN" w:bidi="hi-IN"/>
     </w:rPr>
   </w:style>
   <w:style w:type="paragraph" w:styleId="Heading1">
-    <w:name w:val="Heading 1"/>
+    <w:name w:val="heading 1"/>
     <w:basedOn w:val="Heading"/>
     <w:next w:val="BodyText"/>
     <w:qFormat/>
@@ -2356,7 +2388,6 @@
       <w:jc w:val="center"/>
     </w:pPr>
     <w:rPr>
-      <w:rFonts w:ascii="Noto Sans" w:hAnsi="Noto Sans"/>
       <w:b/>
       <w:bCs/>
       <w:caps/>
@@ -2365,7 +2396,7 @@
     </w:rPr>
   </w:style>
   <w:style w:type="paragraph" w:styleId="Heading2">
-    <w:name w:val="Heading 2"/>
+    <w:name w:val="heading 2"/>
     <w:basedOn w:val="Heading"/>
     <w:next w:val="BodyText"/>
     <w:qFormat/>
@@ -2377,7 +2408,7 @@
       <w:outlineLvl w:val="1"/>
     </w:pPr>
     <w:rPr>
-      <w:rFonts w:ascii="Liberation Serif" w:hAnsi="Liberation Serif" w:eastAsia="Noto Sans" w:cs="Noto Sans Devanagari"/>
+      <w:rFonts w:ascii="Liberation Serif" w:hAnsi="Liberation Serif" w:eastAsia="Noto Serif CJK SC" w:cs="Noto Sans Devanagari"/>
       <w:b/>
       <w:bCs/>
       <w:sz w:val="24"/>
@@ -2385,7 +2416,7 @@
     </w:rPr>
   </w:style>
   <w:style w:type="paragraph" w:styleId="Heading3">
-    <w:name w:val="Heading 3"/>
+    <w:name w:val="heading 3"/>
     <w:basedOn w:val="Heading"/>
     <w:next w:val="BodyText"/>
     <w:qFormat/>
@@ -2394,11 +2425,23 @@
       <w:outlineLvl w:val="2"/>
     </w:pPr>
     <w:rPr>
-      <w:rFonts w:ascii="Liberation Serif" w:hAnsi="Liberation Serif" w:eastAsia="Noto Sans" w:cs="Noto Sans Devanagari"/>
+      <w:rFonts w:ascii="Liberation Serif" w:hAnsi="Liberation Serif" w:eastAsia="Noto Serif CJK SC" w:cs="Noto Sans Devanagari"/>
       <w:b/>
       <w:bCs/>
       <w:sz w:val="22"/>
       <w:szCs w:val="22"/>
+    </w:rPr>
+  </w:style>
+  <w:style w:type="character" w:styleId="EndnoteReference">
+    <w:name w:val="endnote reference"/>
+    <w:rPr>
+      <w:vertAlign w:val="superscript"/>
+    </w:rPr>
+  </w:style>
+  <w:style w:type="character" w:styleId="FootnoteReference">
+    <w:name w:val="footnote reference"/>
+    <w:rPr>
+      <w:vertAlign w:val="superscript"/>
     </w:rPr>
   </w:style>
   <w:style w:type="character" w:styleId="EndnoteCharacters">
@@ -2464,7 +2507,7 @@
     </w:rPr>
   </w:style>
   <w:style w:type="paragraph" w:styleId="EnvelopeReturn">
-    <w:name w:val="Envelope Return"/>
+    <w:name w:val="envelope return"/>
     <w:basedOn w:val="Normal"/>
     <w:pPr/>
     <w:rPr>
@@ -2476,46 +2519,6 @@
     <w:basedOn w:val="BodyText"/>
     <w:qFormat/>
     <w:pPr/>
-    <w:rPr/>
-  </w:style>
-  <w:style w:type="paragraph" w:styleId="Footer">
-    <w:name w:val="Footer"/>
-    <w:basedOn w:val="Normal"/>
-    <w:pPr>
-      <w:suppressLineNumbers/>
-      <w:tabs>
-        <w:tab w:val="clear" w:pos="1134"/>
-        <w:tab w:val="center" w:pos="4818" w:leader="none"/>
-        <w:tab w:val="right" w:pos="9637" w:leader="none"/>
-      </w:tabs>
-    </w:pPr>
-    <w:rPr/>
-  </w:style>
-  <w:style w:type="paragraph" w:styleId="Header">
-    <w:name w:val="Header"/>
-    <w:basedOn w:val="Normal"/>
-    <w:pPr>
-      <w:suppressLineNumbers/>
-      <w:tabs>
-        <w:tab w:val="clear" w:pos="1134"/>
-        <w:tab w:val="center" w:pos="4818" w:leader="none"/>
-        <w:tab w:val="right" w:pos="9637" w:leader="none"/>
-      </w:tabs>
-    </w:pPr>
-    <w:rPr/>
-  </w:style>
-  <w:style w:type="paragraph" w:styleId="HeaderandFooter">
-    <w:name w:val="Header and Footer"/>
-    <w:basedOn w:val="Normal"/>
-    <w:qFormat/>
-    <w:pPr>
-      <w:suppressLineNumbers/>
-      <w:tabs>
-        <w:tab w:val="clear" w:pos="1134"/>
-        <w:tab w:val="center" w:pos="4819" w:leader="none"/>
-        <w:tab w:val="right" w:pos="9638" w:leader="none"/>
-      </w:tabs>
-    </w:pPr>
     <w:rPr/>
   </w:style>
   <w:style w:type="paragraph" w:styleId="Index">
@@ -2530,7 +2533,7 @@
     </w:rPr>
   </w:style>
   <w:style w:type="paragraph" w:styleId="Caption">
-    <w:name w:val="Caption"/>
+    <w:name w:val="caption"/>
     <w:basedOn w:val="Normal"/>
     <w:qFormat/>
     <w:pPr>
@@ -2558,7 +2561,7 @@
     <w:basedOn w:val="Normal"/>
     <w:pPr>
       <w:spacing w:before="90" w:after="90"/>
-      <w:jc w:val="both"/>
+      <w:jc w:val="start"/>
     </w:pPr>
     <w:rPr/>
   </w:style>
@@ -2588,37 +2591,37 @@
         <a:srgbClr val="000000"/>
       </a:dk1>
       <a:lt1>
-        <a:srgbClr val="ffffff"/>
+        <a:srgbClr val="FFFFFF"/>
       </a:lt1>
       <a:dk2>
         <a:srgbClr val="000000"/>
       </a:dk2>
       <a:lt2>
-        <a:srgbClr val="ffffff"/>
+        <a:srgbClr val="FFFFFF"/>
       </a:lt2>
       <a:accent1>
-        <a:srgbClr val="18a303"/>
+        <a:srgbClr val="18A303"/>
       </a:accent1>
       <a:accent2>
-        <a:srgbClr val="0369a3"/>
+        <a:srgbClr val="0369A3"/>
       </a:accent2>
       <a:accent3>
-        <a:srgbClr val="a33e03"/>
+        <a:srgbClr val="A33E03"/>
       </a:accent3>
       <a:accent4>
-        <a:srgbClr val="8e03a3"/>
+        <a:srgbClr val="8E03A3"/>
       </a:accent4>
       <a:accent5>
-        <a:srgbClr val="c99c00"/>
+        <a:srgbClr val="C99C00"/>
       </a:accent5>
       <a:accent6>
-        <a:srgbClr val="c9211e"/>
+        <a:srgbClr val="C9211E"/>
       </a:accent6>
       <a:hlink>
-        <a:srgbClr val="0000ee"/>
+        <a:srgbClr val="0000EE"/>
       </a:hlink>
       <a:folHlink>
-        <a:srgbClr val="551a8b"/>
+        <a:srgbClr val="551A8B"/>
       </a:folHlink>
     </a:clrScheme>
     <a:fontScheme name="Office">

</xml_diff>

<commit_message>
Poprawki merytoryczne: termin 7 dni jako rozsadny, warianty adresata, klauzula 819 par.4, sumy gwarancyjne 100k/75k EUR
</commit_message>
<xml_diff>
--- a/dist/research-OC-dentysty.docx
+++ b/dist/research-OC-dentysty.docx
@@ -1,6 +1,6 @@
 
 <file path=word/document.xml><?xml version="1.0" encoding="utf-8"?>
-<w:document xmlns:o="urn:schemas-microsoft-com:office:office" xmlns:r="http://schemas.openxmlformats.org/officeDocument/2006/relationships" xmlns:v="urn:schemas-microsoft-com:vml" xmlns:w="http://schemas.openxmlformats.org/wordprocessingml/2006/main" xmlns:w10="urn:schemas-microsoft-com:office:word" xmlns:wp="http://schemas.openxmlformats.org/drawingml/2006/wordprocessingDrawing" xmlns:wps="http://schemas.microsoft.com/office/word/2010/wordprocessingShape" xmlns:wpg="http://schemas.microsoft.com/office/word/2010/wordprocessingGroup" xmlns:mc="http://schemas.openxmlformats.org/markup-compatibility/2006" xmlns:wp14="http://schemas.microsoft.com/office/word/2010/wordprocessingDrawing" xmlns:w14="http://schemas.microsoft.com/office/word/2010/wordml" xmlns:w15="http://schemas.microsoft.com/office/word/2012/wordml" mc:Ignorable="w14 wp14 w15">
+<w:document xmlns:o="urn:schemas-microsoft-com:office:office" xmlns:r="http://schemas.openxmlformats.org/officeDocument/2006/relationships" xmlns:v="urn:schemas-microsoft-com:vml" xmlns:w="http://schemas.openxmlformats.org/wordprocessingml/2006/main" xmlns:w10="urn:schemas-microsoft-com:office:word" xmlns:wp="http://schemas.openxmlformats.org/drawingml/2006/wordprocessingDrawing" xmlns:pic="http://schemas.openxmlformats.org/drawingml/2006/picture" xmlns:wps="http://schemas.microsoft.com/office/word/2010/wordprocessingShape" xmlns:wpg="http://schemas.microsoft.com/office/word/2010/wordprocessingGroup" xmlns:mc="http://schemas.openxmlformats.org/markup-compatibility/2006" xmlns:wp14="http://schemas.microsoft.com/office/word/2010/wordprocessingDrawing" xmlns:w14="http://schemas.microsoft.com/office/word/2010/wordml" xmlns:w15="http://schemas.microsoft.com/office/word/2012/wordml" mc:Ignorable="w14 wp14 w15">
   <w:body>
     <w:p>
       <w:pPr>
@@ -266,27 +266,27 @@
       </w:r>
       <w:r>
         <w:rPr/>
-        <w:t xml:space="preserve"> Dla indywidualnej praktyki lekarskiej/dentystycznej wynoszą minimum </w:t>
-      </w:r>
-      <w:r>
-        <w:rPr>
-          <w:rStyle w:val="Strong"/>
-        </w:rPr>
-        <w:t>75 000 EUR na jedno zdarzenie</w:t>
-      </w:r>
-      <w:r>
-        <w:rPr/>
-        <w:t xml:space="preserve"> oraz </w:t>
-      </w:r>
-      <w:r>
-        <w:rPr>
-          <w:rStyle w:val="Strong"/>
-        </w:rPr>
-        <w:t>350 000 EUR na wszystkie zdarzenia</w:t>
-      </w:r>
-      <w:r>
-        <w:rPr/>
-        <w:t xml:space="preserve"> w okresie ubezpieczenia (tj. ok. 320 000 zł na pojedynczą szkodę). Zdecydowana większość roszczeń stomatologicznych mieści się w tej kwocie. </w:t>
+        <w:t xml:space="preserve"> Zgodnie z § 3 rozporządzenia MF z 29.04.2019 r. wynoszą one, w okresie ubezpieczenia do 12 miesięcy: </w:t>
+      </w:r>
+      <w:r>
+        <w:rPr>
+          <w:rStyle w:val="Strong"/>
+        </w:rPr>
+        <w:t>100 000 EUR na jedno zdarzenie / 500 000 EUR na wszystkie zdarzenia</w:t>
+      </w:r>
+      <w:r>
+        <w:rPr/>
+        <w:t xml:space="preserve"> — podmioty udzielające szpitalnych świadczeń zdrowotnych (art. 8 pkt 1 lit. a u.d.l.) oraz </w:t>
+      </w:r>
+      <w:r>
+        <w:rPr>
+          <w:rStyle w:val="Strong"/>
+        </w:rPr>
+        <w:t>75 000 EUR na jedno zdarzenie / 350 000 EUR na wszystkie zdarzenia</w:t>
+      </w:r>
+      <w:r>
+        <w:rPr/>
+        <w:t xml:space="preserve"> — pozostałe podmioty, w tym gabinety ambulatoryjne i indywidualne / indywidualne specjalistyczne praktyki lekarskie i dentystyczne (art. 8 pkt 1 lit. b i pkt 2 u.d.l.), tj. ok. 320 000 zł na pojedynczą szkodę. Zdecydowana większość roszczeń stomatologicznych mieści się w tej kwocie. </w:t>
       </w:r>
     </w:p>
     <w:p>
@@ -354,6 +354,16 @@
         <w:rPr/>
         <w:t xml:space="preserve"> Zgodnie z art. 14 ust. 2 pkt 2 ustawy o działalności leczniczej pacjent ma prawo do informacji o danych ubezpieczyciela OC i numerze polisy podmiotu leczniczego. </w:t>
       </w:r>
+      <w:r>
+        <w:rPr>
+          <w:rStyle w:val="Emphasis"/>
+        </w:rPr>
+        <w:t>Uwaga: przepis nie wyznacza terminu ustawowego na udzielenie tej informacji (termin 14-dniowy z art. 14 ust. 4 dotyczy wyłącznie danych transgranicznych z ust. 3) — we wzorze pisma wyznaczono rozsądny termin 7 dni.</w:t>
+      </w:r>
+      <w:r>
+        <w:rPr/>
+        <w:t xml:space="preserve"> </w:t>
+      </w:r>
     </w:p>
     <w:p>
       <w:pPr>
@@ -516,7 +526,7 @@
       </w:r>
       <w:r>
         <w:rPr/>
-        <w:t xml:space="preserve"> (art. 442¹ § 1 i § 3 KC). Momentem powzięcia wiedzy jest zazwyczaj data konsultacji weryfikacyjnej, a nie pierwotne błędne badanie. Zgodnie z art. 819 § 4 KC zgłoszenie ubezpieczycielowi roszczenia przerywa bieg przedawnienia. </w:t>
+        <w:t xml:space="preserve"> (art. 442¹ § 1 i § 3 KC). Momentem powzięcia wiedzy jest zazwyczaj data konsultacji weryfikacyjnej, a nie pierwotne błędne badanie. Zgodnie z art. 819 § 4 KC zgłoszenie ubezpieczycielowi roszczenia (lub zdarzenia) przerywa bieg przedawnienia roszczenia o świadczenie do ubezpieczyciela, a bieg rozpoczyna się na nowo od dnia otrzymania pisemnego oświadczenia ubezpieczyciela o przyznaniu lub odmowie świadczenia. </w:t>
       </w:r>
     </w:p>
     <w:p>
@@ -2164,7 +2174,7 @@
       <w:start w:val="1"/>
       <w:numFmt w:val="none"/>
       <w:suff w:val="nothing"/>
-      <w:lvlText w:val="%1"/>
+      <w:lvlText w:val=""/>
       <w:lvlJc w:val="start"/>
       <w:pPr>
         <w:tabs>
@@ -2175,10 +2185,37 @@
     </w:lvl>
     <w:lvl w:ilvl="1">
       <w:start w:val="1"/>
+      <w:numFmt w:val="none"/>
       <w:pStyle w:val="Heading2"/>
+      <w:suff w:val="nothing"/>
+      <w:lvlText w:val=""/>
+      <w:lvlJc w:val="start"/>
+      <w:pPr>
+        <w:tabs>
+          <w:tab w:val="num" w:pos="0"/>
+        </w:tabs>
+        <w:ind w:start="0" w:hanging="0"/>
+      </w:pPr>
+    </w:lvl>
+    <w:lvl w:ilvl="2">
+      <w:start w:val="1"/>
+      <w:numFmt w:val="none"/>
+      <w:pStyle w:val="Heading3"/>
+      <w:suff w:val="nothing"/>
+      <w:lvlText w:val=""/>
+      <w:lvlJc w:val="start"/>
+      <w:pPr>
+        <w:tabs>
+          <w:tab w:val="num" w:pos="0"/>
+        </w:tabs>
+        <w:ind w:start="0" w:hanging="0"/>
+      </w:pPr>
+    </w:lvl>
+    <w:lvl w:ilvl="3">
+      <w:start w:val="1"/>
       <w:numFmt w:val="none"/>
       <w:suff w:val="nothing"/>
-      <w:lvlText w:val="%2"/>
+      <w:lvlText w:val=""/>
       <w:lvlJc w:val="start"/>
       <w:pPr>
         <w:tabs>
@@ -2187,12 +2224,11 @@
         <w:ind w:start="0" w:hanging="0"/>
       </w:pPr>
     </w:lvl>
-    <w:lvl w:ilvl="2">
-      <w:start w:val="1"/>
-      <w:pStyle w:val="Heading3"/>
+    <w:lvl w:ilvl="4">
+      <w:start w:val="1"/>
       <w:numFmt w:val="none"/>
       <w:suff w:val="nothing"/>
-      <w:lvlText w:val="%3"/>
+      <w:lvlText w:val=""/>
       <w:lvlJc w:val="start"/>
       <w:pPr>
         <w:tabs>
@@ -2201,11 +2237,11 @@
         <w:ind w:start="0" w:hanging="0"/>
       </w:pPr>
     </w:lvl>
-    <w:lvl w:ilvl="3">
+    <w:lvl w:ilvl="5">
       <w:start w:val="1"/>
       <w:numFmt w:val="none"/>
       <w:suff w:val="nothing"/>
-      <w:lvlText w:val="%4"/>
+      <w:lvlText w:val=""/>
       <w:lvlJc w:val="start"/>
       <w:pPr>
         <w:tabs>
@@ -2214,11 +2250,11 @@
         <w:ind w:start="0" w:hanging="0"/>
       </w:pPr>
     </w:lvl>
-    <w:lvl w:ilvl="4">
+    <w:lvl w:ilvl="6">
       <w:start w:val="1"/>
       <w:numFmt w:val="none"/>
       <w:suff w:val="nothing"/>
-      <w:lvlText w:val="%5"/>
+      <w:lvlText w:val=""/>
       <w:lvlJc w:val="start"/>
       <w:pPr>
         <w:tabs>
@@ -2227,11 +2263,11 @@
         <w:ind w:start="0" w:hanging="0"/>
       </w:pPr>
     </w:lvl>
-    <w:lvl w:ilvl="5">
+    <w:lvl w:ilvl="7">
       <w:start w:val="1"/>
       <w:numFmt w:val="none"/>
       <w:suff w:val="nothing"/>
-      <w:lvlText w:val="%6"/>
+      <w:lvlText w:val=""/>
       <w:lvlJc w:val="start"/>
       <w:pPr>
         <w:tabs>
@@ -2240,37 +2276,11 @@
         <w:ind w:start="0" w:hanging="0"/>
       </w:pPr>
     </w:lvl>
-    <w:lvl w:ilvl="6">
+    <w:lvl w:ilvl="8">
       <w:start w:val="1"/>
       <w:numFmt w:val="none"/>
       <w:suff w:val="nothing"/>
-      <w:lvlText w:val="%7"/>
-      <w:lvlJc w:val="start"/>
-      <w:pPr>
-        <w:tabs>
-          <w:tab w:val="num" w:pos="0"/>
-        </w:tabs>
-        <w:ind w:start="0" w:hanging="0"/>
-      </w:pPr>
-    </w:lvl>
-    <w:lvl w:ilvl="7">
-      <w:start w:val="1"/>
-      <w:numFmt w:val="none"/>
-      <w:suff w:val="nothing"/>
-      <w:lvlText w:val="%8"/>
-      <w:lvlJc w:val="start"/>
-      <w:pPr>
-        <w:tabs>
-          <w:tab w:val="num" w:pos="0"/>
-        </w:tabs>
-        <w:ind w:start="0" w:hanging="0"/>
-      </w:pPr>
-    </w:lvl>
-    <w:lvl w:ilvl="8">
-      <w:start w:val="1"/>
-      <w:numFmt w:val="none"/>
-      <w:suff w:val="nothing"/>
-      <w:lvlText w:val="%9"/>
+      <w:lvlText w:val=""/>
       <w:lvlJc w:val="start"/>
       <w:pPr>
         <w:tabs>
@@ -2315,10 +2325,10 @@
   <w:docDefaults>
     <w:rPrDefault>
       <w:rPr>
-        <w:rFonts w:ascii="Liberation Serif" w:hAnsi="Liberation Serif" w:eastAsia="Noto Sans" w:cs="Noto Sans Devanagari"/>
+        <w:rFonts w:ascii="Liberation Serif" w:hAnsi="Liberation Serif" w:eastAsia="Noto Serif CJK SC" w:cs="Noto Sans Devanagari"/>
         <w:sz w:val="24"/>
         <w:szCs w:val="24"/>
-        <w:lang w:val="en-US" w:eastAsia="zh-CN" w:bidi="hi-IN"/>
+        <w:lang w:val="pl-PL" w:eastAsia="zh-CN" w:bidi="hi-IN"/>
       </w:rPr>
     </w:rPrDefault>
     <w:pPrDefault>
@@ -2340,11 +2350,11 @@
       <w:color w:val="111111"/>
       <w:sz w:val="21"/>
       <w:szCs w:val="21"/>
-      <w:lang w:val="en-US" w:eastAsia="zh-CN" w:bidi="hi-IN"/>
+      <w:lang w:val="pl-PL" w:eastAsia="zh-CN" w:bidi="hi-IN"/>
     </w:rPr>
   </w:style>
   <w:style w:type="paragraph" w:styleId="Heading1">
-    <w:name w:val="Heading 1"/>
+    <w:name w:val="heading 1"/>
     <w:basedOn w:val="Heading"/>
     <w:next w:val="BodyText"/>
     <w:qFormat/>
@@ -2356,7 +2366,6 @@
       <w:jc w:val="center"/>
     </w:pPr>
     <w:rPr>
-      <w:rFonts w:ascii="Noto Sans" w:hAnsi="Noto Sans"/>
       <w:b/>
       <w:bCs/>
       <w:caps/>
@@ -2365,7 +2374,7 @@
     </w:rPr>
   </w:style>
   <w:style w:type="paragraph" w:styleId="Heading2">
-    <w:name w:val="Heading 2"/>
+    <w:name w:val="heading 2"/>
     <w:basedOn w:val="Heading"/>
     <w:next w:val="BodyText"/>
     <w:qFormat/>
@@ -2378,7 +2387,7 @@
       <w:outlineLvl w:val="1"/>
     </w:pPr>
     <w:rPr>
-      <w:rFonts w:ascii="Liberation Serif" w:hAnsi="Liberation Serif" w:eastAsia="Noto Sans" w:cs="Noto Sans Devanagari"/>
+      <w:rFonts w:ascii="Liberation Serif" w:hAnsi="Liberation Serif" w:eastAsia="Noto Serif CJK SC" w:cs="Noto Sans Devanagari"/>
       <w:b/>
       <w:bCs/>
       <w:sz w:val="24"/>
@@ -2386,7 +2395,7 @@
     </w:rPr>
   </w:style>
   <w:style w:type="paragraph" w:styleId="Heading3">
-    <w:name w:val="Heading 3"/>
+    <w:name w:val="heading 3"/>
     <w:basedOn w:val="Heading"/>
     <w:next w:val="BodyText"/>
     <w:qFormat/>
@@ -2396,11 +2405,23 @@
       <w:outlineLvl w:val="2"/>
     </w:pPr>
     <w:rPr>
-      <w:rFonts w:ascii="Liberation Serif" w:hAnsi="Liberation Serif" w:eastAsia="Noto Sans" w:cs="Noto Sans Devanagari"/>
+      <w:rFonts w:ascii="Liberation Serif" w:hAnsi="Liberation Serif" w:eastAsia="Noto Serif CJK SC" w:cs="Noto Sans Devanagari"/>
       <w:b/>
       <w:bCs/>
       <w:sz w:val="22"/>
       <w:szCs w:val="22"/>
+    </w:rPr>
+  </w:style>
+  <w:style w:type="character" w:styleId="EndnoteReference">
+    <w:name w:val="endnote reference"/>
+    <w:rPr>
+      <w:vertAlign w:val="superscript"/>
+    </w:rPr>
+  </w:style>
+  <w:style w:type="character" w:styleId="FootnoteReference">
+    <w:name w:val="footnote reference"/>
+    <w:rPr>
+      <w:vertAlign w:val="superscript"/>
     </w:rPr>
   </w:style>
   <w:style w:type="character" w:styleId="EndnoteCharacters">
@@ -2466,7 +2487,7 @@
     </w:rPr>
   </w:style>
   <w:style w:type="paragraph" w:styleId="EnvelopeReturn">
-    <w:name w:val="Envelope Return"/>
+    <w:name w:val="envelope return"/>
     <w:basedOn w:val="Normal"/>
     <w:pPr/>
     <w:rPr>
@@ -2478,46 +2499,6 @@
     <w:basedOn w:val="BodyText"/>
     <w:qFormat/>
     <w:pPr/>
-    <w:rPr/>
-  </w:style>
-  <w:style w:type="paragraph" w:styleId="Footer">
-    <w:name w:val="Footer"/>
-    <w:basedOn w:val="Normal"/>
-    <w:pPr>
-      <w:suppressLineNumbers/>
-      <w:tabs>
-        <w:tab w:val="clear" w:pos="1134"/>
-        <w:tab w:val="center" w:pos="4818" w:leader="none"/>
-        <w:tab w:val="right" w:pos="9637" w:leader="none"/>
-      </w:tabs>
-    </w:pPr>
-    <w:rPr/>
-  </w:style>
-  <w:style w:type="paragraph" w:styleId="Header">
-    <w:name w:val="Header"/>
-    <w:basedOn w:val="Normal"/>
-    <w:pPr>
-      <w:suppressLineNumbers/>
-      <w:tabs>
-        <w:tab w:val="clear" w:pos="1134"/>
-        <w:tab w:val="center" w:pos="4818" w:leader="none"/>
-        <w:tab w:val="right" w:pos="9637" w:leader="none"/>
-      </w:tabs>
-    </w:pPr>
-    <w:rPr/>
-  </w:style>
-  <w:style w:type="paragraph" w:styleId="HeaderandFooter">
-    <w:name w:val="Header and Footer"/>
-    <w:basedOn w:val="Normal"/>
-    <w:qFormat/>
-    <w:pPr>
-      <w:suppressLineNumbers/>
-      <w:tabs>
-        <w:tab w:val="clear" w:pos="1134"/>
-        <w:tab w:val="center" w:pos="4819" w:leader="none"/>
-        <w:tab w:val="right" w:pos="9638" w:leader="none"/>
-      </w:tabs>
-    </w:pPr>
     <w:rPr/>
   </w:style>
   <w:style w:type="paragraph" w:styleId="Index">
@@ -2532,7 +2513,7 @@
     </w:rPr>
   </w:style>
   <w:style w:type="paragraph" w:styleId="Caption">
-    <w:name w:val="Caption"/>
+    <w:name w:val="caption"/>
     <w:basedOn w:val="Normal"/>
     <w:qFormat/>
     <w:pPr>
@@ -2592,37 +2573,37 @@
         <a:srgbClr val="000000"/>
       </a:dk1>
       <a:lt1>
-        <a:srgbClr val="ffffff"/>
+        <a:srgbClr val="FFFFFF"/>
       </a:lt1>
       <a:dk2>
         <a:srgbClr val="000000"/>
       </a:dk2>
       <a:lt2>
-        <a:srgbClr val="ffffff"/>
+        <a:srgbClr val="FFFFFF"/>
       </a:lt2>
       <a:accent1>
-        <a:srgbClr val="18a303"/>
+        <a:srgbClr val="18A303"/>
       </a:accent1>
       <a:accent2>
-        <a:srgbClr val="0369a3"/>
+        <a:srgbClr val="0369A3"/>
       </a:accent2>
       <a:accent3>
-        <a:srgbClr val="a33e03"/>
+        <a:srgbClr val="A33E03"/>
       </a:accent3>
       <a:accent4>
-        <a:srgbClr val="8e03a3"/>
+        <a:srgbClr val="8E03A3"/>
       </a:accent4>
       <a:accent5>
-        <a:srgbClr val="c99c00"/>
+        <a:srgbClr val="C99C00"/>
       </a:accent5>
       <a:accent6>
-        <a:srgbClr val="c9211e"/>
+        <a:srgbClr val="C9211E"/>
       </a:accent6>
       <a:hlink>
-        <a:srgbClr val="0000ee"/>
+        <a:srgbClr val="0000EE"/>
       </a:hlink>
       <a:folHlink>
-        <a:srgbClr val="551a8b"/>
+        <a:srgbClr val="551A8B"/>
       </a:folHlink>
     </a:clrScheme>
     <a:fontScheme name="Office">

</xml_diff>

<commit_message>
Fix podkreslen: usuniecie text-align-last (bug LibreOffice), zostaje justify+hyphens
</commit_message>
<xml_diff>
--- a/dist/research-OC-dentysty.docx
+++ b/dist/research-OC-dentysty.docx
@@ -1,6 +1,6 @@
 
 <file path=word/document.xml><?xml version="1.0" encoding="utf-8"?>
-<w:document xmlns:o="urn:schemas-microsoft-com:office:office" xmlns:r="http://schemas.openxmlformats.org/officeDocument/2006/relationships" xmlns:v="urn:schemas-microsoft-com:vml" xmlns:w="http://schemas.openxmlformats.org/wordprocessingml/2006/main" xmlns:w10="urn:schemas-microsoft-com:office:word" xmlns:wp="http://schemas.openxmlformats.org/drawingml/2006/wordprocessingDrawing" xmlns:wps="http://schemas.microsoft.com/office/word/2010/wordprocessingShape" xmlns:wpg="http://schemas.microsoft.com/office/word/2010/wordprocessingGroup" xmlns:mc="http://schemas.openxmlformats.org/markup-compatibility/2006" xmlns:wp14="http://schemas.microsoft.com/office/word/2010/wordprocessingDrawing" xmlns:w14="http://schemas.microsoft.com/office/word/2010/wordml" xmlns:w15="http://schemas.microsoft.com/office/word/2012/wordml" mc:Ignorable="w14 wp14 w15">
+<w:document xmlns:o="urn:schemas-microsoft-com:office:office" xmlns:r="http://schemas.openxmlformats.org/officeDocument/2006/relationships" xmlns:v="urn:schemas-microsoft-com:vml" xmlns:w="http://schemas.openxmlformats.org/wordprocessingml/2006/main" xmlns:w10="urn:schemas-microsoft-com:office:word" xmlns:wp="http://schemas.openxmlformats.org/drawingml/2006/wordprocessingDrawing" xmlns:pic="http://schemas.openxmlformats.org/drawingml/2006/picture" xmlns:wps="http://schemas.microsoft.com/office/word/2010/wordprocessingShape" xmlns:wpg="http://schemas.microsoft.com/office/word/2010/wordprocessingGroup" xmlns:mc="http://schemas.openxmlformats.org/markup-compatibility/2006" xmlns:wp14="http://schemas.microsoft.com/office/word/2010/wordprocessingDrawing" xmlns:w14="http://schemas.microsoft.com/office/word/2010/wordml" xmlns:w15="http://schemas.microsoft.com/office/word/2012/wordml" mc:Ignorable="w14 wp14 w15">
   <w:body>
     <w:p>
       <w:pPr>
@@ -2174,7 +2174,7 @@
       <w:start w:val="1"/>
       <w:numFmt w:val="none"/>
       <w:suff w:val="nothing"/>
-      <w:lvlText w:val="%1"/>
+      <w:lvlText w:val=""/>
       <w:lvlJc w:val="start"/>
       <w:pPr>
         <w:tabs>
@@ -2185,10 +2185,37 @@
     </w:lvl>
     <w:lvl w:ilvl="1">
       <w:start w:val="1"/>
+      <w:numFmt w:val="none"/>
       <w:pStyle w:val="Heading2"/>
+      <w:suff w:val="nothing"/>
+      <w:lvlText w:val=""/>
+      <w:lvlJc w:val="start"/>
+      <w:pPr>
+        <w:tabs>
+          <w:tab w:val="num" w:pos="0"/>
+        </w:tabs>
+        <w:ind w:start="0" w:hanging="0"/>
+      </w:pPr>
+    </w:lvl>
+    <w:lvl w:ilvl="2">
+      <w:start w:val="1"/>
+      <w:numFmt w:val="none"/>
+      <w:pStyle w:val="Heading3"/>
+      <w:suff w:val="nothing"/>
+      <w:lvlText w:val=""/>
+      <w:lvlJc w:val="start"/>
+      <w:pPr>
+        <w:tabs>
+          <w:tab w:val="num" w:pos="0"/>
+        </w:tabs>
+        <w:ind w:start="0" w:hanging="0"/>
+      </w:pPr>
+    </w:lvl>
+    <w:lvl w:ilvl="3">
+      <w:start w:val="1"/>
       <w:numFmt w:val="none"/>
       <w:suff w:val="nothing"/>
-      <w:lvlText w:val="%2"/>
+      <w:lvlText w:val=""/>
       <w:lvlJc w:val="start"/>
       <w:pPr>
         <w:tabs>
@@ -2197,12 +2224,11 @@
         <w:ind w:start="0" w:hanging="0"/>
       </w:pPr>
     </w:lvl>
-    <w:lvl w:ilvl="2">
-      <w:start w:val="1"/>
-      <w:pStyle w:val="Heading3"/>
+    <w:lvl w:ilvl="4">
+      <w:start w:val="1"/>
       <w:numFmt w:val="none"/>
       <w:suff w:val="nothing"/>
-      <w:lvlText w:val="%3"/>
+      <w:lvlText w:val=""/>
       <w:lvlJc w:val="start"/>
       <w:pPr>
         <w:tabs>
@@ -2211,11 +2237,11 @@
         <w:ind w:start="0" w:hanging="0"/>
       </w:pPr>
     </w:lvl>
-    <w:lvl w:ilvl="3">
+    <w:lvl w:ilvl="5">
       <w:start w:val="1"/>
       <w:numFmt w:val="none"/>
       <w:suff w:val="nothing"/>
-      <w:lvlText w:val="%4"/>
+      <w:lvlText w:val=""/>
       <w:lvlJc w:val="start"/>
       <w:pPr>
         <w:tabs>
@@ -2224,11 +2250,11 @@
         <w:ind w:start="0" w:hanging="0"/>
       </w:pPr>
     </w:lvl>
-    <w:lvl w:ilvl="4">
+    <w:lvl w:ilvl="6">
       <w:start w:val="1"/>
       <w:numFmt w:val="none"/>
       <w:suff w:val="nothing"/>
-      <w:lvlText w:val="%5"/>
+      <w:lvlText w:val=""/>
       <w:lvlJc w:val="start"/>
       <w:pPr>
         <w:tabs>
@@ -2237,11 +2263,11 @@
         <w:ind w:start="0" w:hanging="0"/>
       </w:pPr>
     </w:lvl>
-    <w:lvl w:ilvl="5">
+    <w:lvl w:ilvl="7">
       <w:start w:val="1"/>
       <w:numFmt w:val="none"/>
       <w:suff w:val="nothing"/>
-      <w:lvlText w:val="%6"/>
+      <w:lvlText w:val=""/>
       <w:lvlJc w:val="start"/>
       <w:pPr>
         <w:tabs>
@@ -2250,37 +2276,11 @@
         <w:ind w:start="0" w:hanging="0"/>
       </w:pPr>
     </w:lvl>
-    <w:lvl w:ilvl="6">
+    <w:lvl w:ilvl="8">
       <w:start w:val="1"/>
       <w:numFmt w:val="none"/>
       <w:suff w:val="nothing"/>
-      <w:lvlText w:val="%7"/>
-      <w:lvlJc w:val="start"/>
-      <w:pPr>
-        <w:tabs>
-          <w:tab w:val="num" w:pos="0"/>
-        </w:tabs>
-        <w:ind w:start="0" w:hanging="0"/>
-      </w:pPr>
-    </w:lvl>
-    <w:lvl w:ilvl="7">
-      <w:start w:val="1"/>
-      <w:numFmt w:val="none"/>
-      <w:suff w:val="nothing"/>
-      <w:lvlText w:val="%8"/>
-      <w:lvlJc w:val="start"/>
-      <w:pPr>
-        <w:tabs>
-          <w:tab w:val="num" w:pos="0"/>
-        </w:tabs>
-        <w:ind w:start="0" w:hanging="0"/>
-      </w:pPr>
-    </w:lvl>
-    <w:lvl w:ilvl="8">
-      <w:start w:val="1"/>
-      <w:numFmt w:val="none"/>
-      <w:suff w:val="nothing"/>
-      <w:lvlText w:val="%9"/>
+      <w:lvlText w:val=""/>
       <w:lvlJc w:val="start"/>
       <w:pPr>
         <w:tabs>
@@ -2325,10 +2325,10 @@
   <w:docDefaults>
     <w:rPrDefault>
       <w:rPr>
-        <w:rFonts w:ascii="Liberation Serif" w:hAnsi="Liberation Serif" w:eastAsia="Noto Sans" w:cs="Noto Sans Devanagari"/>
+        <w:rFonts w:ascii="Liberation Serif" w:hAnsi="Liberation Serif" w:eastAsia="Noto Serif CJK SC" w:cs="Noto Sans Devanagari"/>
         <w:sz w:val="24"/>
         <w:szCs w:val="24"/>
-        <w:lang w:val="en-US" w:eastAsia="zh-CN" w:bidi="hi-IN"/>
+        <w:lang w:val="pl-PL" w:eastAsia="zh-CN" w:bidi="hi-IN"/>
       </w:rPr>
     </w:rPrDefault>
     <w:pPrDefault>
@@ -2350,11 +2350,11 @@
       <w:color w:val="111111"/>
       <w:sz w:val="21"/>
       <w:szCs w:val="21"/>
-      <w:lang w:val="en-US" w:eastAsia="zh-CN" w:bidi="hi-IN"/>
+      <w:lang w:val="pl-PL" w:eastAsia="zh-CN" w:bidi="hi-IN"/>
     </w:rPr>
   </w:style>
   <w:style w:type="paragraph" w:styleId="Heading1">
-    <w:name w:val="Heading 1"/>
+    <w:name w:val="heading 1"/>
     <w:basedOn w:val="Heading"/>
     <w:next w:val="BodyText"/>
     <w:qFormat/>
@@ -2366,7 +2366,6 @@
       <w:jc w:val="center"/>
     </w:pPr>
     <w:rPr>
-      <w:rFonts w:ascii="Noto Sans" w:hAnsi="Noto Sans"/>
       <w:b/>
       <w:bCs/>
       <w:caps/>
@@ -2375,7 +2374,7 @@
     </w:rPr>
   </w:style>
   <w:style w:type="paragraph" w:styleId="Heading2">
-    <w:name w:val="Heading 2"/>
+    <w:name w:val="heading 2"/>
     <w:basedOn w:val="Heading"/>
     <w:next w:val="BodyText"/>
     <w:qFormat/>
@@ -2388,7 +2387,7 @@
       <w:outlineLvl w:val="1"/>
     </w:pPr>
     <w:rPr>
-      <w:rFonts w:ascii="Liberation Serif" w:hAnsi="Liberation Serif" w:eastAsia="Noto Sans" w:cs="Noto Sans Devanagari"/>
+      <w:rFonts w:ascii="Liberation Serif" w:hAnsi="Liberation Serif" w:eastAsia="Noto Serif CJK SC" w:cs="Noto Sans Devanagari"/>
       <w:b/>
       <w:bCs/>
       <w:sz w:val="24"/>
@@ -2396,7 +2395,7 @@
     </w:rPr>
   </w:style>
   <w:style w:type="paragraph" w:styleId="Heading3">
-    <w:name w:val="Heading 3"/>
+    <w:name w:val="heading 3"/>
     <w:basedOn w:val="Heading"/>
     <w:next w:val="BodyText"/>
     <w:qFormat/>
@@ -2406,11 +2405,23 @@
       <w:outlineLvl w:val="2"/>
     </w:pPr>
     <w:rPr>
-      <w:rFonts w:ascii="Liberation Serif" w:hAnsi="Liberation Serif" w:eastAsia="Noto Sans" w:cs="Noto Sans Devanagari"/>
+      <w:rFonts w:ascii="Liberation Serif" w:hAnsi="Liberation Serif" w:eastAsia="Noto Serif CJK SC" w:cs="Noto Sans Devanagari"/>
       <w:b/>
       <w:bCs/>
       <w:sz w:val="22"/>
       <w:szCs w:val="22"/>
+    </w:rPr>
+  </w:style>
+  <w:style w:type="character" w:styleId="EndnoteReference">
+    <w:name w:val="endnote reference"/>
+    <w:rPr>
+      <w:vertAlign w:val="superscript"/>
+    </w:rPr>
+  </w:style>
+  <w:style w:type="character" w:styleId="FootnoteReference">
+    <w:name w:val="footnote reference"/>
+    <w:rPr>
+      <w:vertAlign w:val="superscript"/>
     </w:rPr>
   </w:style>
   <w:style w:type="character" w:styleId="EndnoteCharacters">
@@ -2476,7 +2487,7 @@
     </w:rPr>
   </w:style>
   <w:style w:type="paragraph" w:styleId="EnvelopeReturn">
-    <w:name w:val="Envelope Return"/>
+    <w:name w:val="envelope return"/>
     <w:basedOn w:val="Normal"/>
     <w:pPr/>
     <w:rPr>
@@ -2488,46 +2499,6 @@
     <w:basedOn w:val="BodyText"/>
     <w:qFormat/>
     <w:pPr/>
-    <w:rPr/>
-  </w:style>
-  <w:style w:type="paragraph" w:styleId="Footer">
-    <w:name w:val="Footer"/>
-    <w:basedOn w:val="Normal"/>
-    <w:pPr>
-      <w:suppressLineNumbers/>
-      <w:tabs>
-        <w:tab w:val="clear" w:pos="1134"/>
-        <w:tab w:val="center" w:pos="4818" w:leader="none"/>
-        <w:tab w:val="right" w:pos="9637" w:leader="none"/>
-      </w:tabs>
-    </w:pPr>
-    <w:rPr/>
-  </w:style>
-  <w:style w:type="paragraph" w:styleId="Header">
-    <w:name w:val="Header"/>
-    <w:basedOn w:val="Normal"/>
-    <w:pPr>
-      <w:suppressLineNumbers/>
-      <w:tabs>
-        <w:tab w:val="clear" w:pos="1134"/>
-        <w:tab w:val="center" w:pos="4818" w:leader="none"/>
-        <w:tab w:val="right" w:pos="9637" w:leader="none"/>
-      </w:tabs>
-    </w:pPr>
-    <w:rPr/>
-  </w:style>
-  <w:style w:type="paragraph" w:styleId="HeaderandFooter">
-    <w:name w:val="Header and Footer"/>
-    <w:basedOn w:val="Normal"/>
-    <w:qFormat/>
-    <w:pPr>
-      <w:suppressLineNumbers/>
-      <w:tabs>
-        <w:tab w:val="clear" w:pos="1134"/>
-        <w:tab w:val="center" w:pos="4819" w:leader="none"/>
-        <w:tab w:val="right" w:pos="9638" w:leader="none"/>
-      </w:tabs>
-    </w:pPr>
     <w:rPr/>
   </w:style>
   <w:style w:type="paragraph" w:styleId="Index">
@@ -2542,7 +2513,7 @@
     </w:rPr>
   </w:style>
   <w:style w:type="paragraph" w:styleId="Caption">
-    <w:name w:val="Caption"/>
+    <w:name w:val="caption"/>
     <w:basedOn w:val="Normal"/>
     <w:qFormat/>
     <w:pPr>
@@ -2572,9 +2543,7 @@
       <w:spacing w:before="90" w:after="90"/>
       <w:jc w:val="both"/>
     </w:pPr>
-    <w:rPr>
-      <w:u w:val="single"/>
-    </w:rPr>
+    <w:rPr/>
   </w:style>
   <w:style w:type="paragraph" w:styleId="Heading">
     <w:name w:val="Heading"/>
@@ -2602,37 +2571,37 @@
         <a:srgbClr val="000000"/>
       </a:dk1>
       <a:lt1>
-        <a:srgbClr val="ffffff"/>
+        <a:srgbClr val="FFFFFF"/>
       </a:lt1>
       <a:dk2>
         <a:srgbClr val="000000"/>
       </a:dk2>
       <a:lt2>
-        <a:srgbClr val="ffffff"/>
+        <a:srgbClr val="FFFFFF"/>
       </a:lt2>
       <a:accent1>
-        <a:srgbClr val="18a303"/>
+        <a:srgbClr val="18A303"/>
       </a:accent1>
       <a:accent2>
-        <a:srgbClr val="0369a3"/>
+        <a:srgbClr val="0369A3"/>
       </a:accent2>
       <a:accent3>
-        <a:srgbClr val="a33e03"/>
+        <a:srgbClr val="A33E03"/>
       </a:accent3>
       <a:accent4>
-        <a:srgbClr val="8e03a3"/>
+        <a:srgbClr val="8E03A3"/>
       </a:accent4>
       <a:accent5>
-        <a:srgbClr val="c99c00"/>
+        <a:srgbClr val="C99C00"/>
       </a:accent5>
       <a:accent6>
-        <a:srgbClr val="c9211e"/>
+        <a:srgbClr val="C9211E"/>
       </a:accent6>
       <a:hlink>
-        <a:srgbClr val="0000ee"/>
+        <a:srgbClr val="0000EE"/>
       </a:hlink>
       <a:folHlink>
-        <a:srgbClr val="551a8b"/>
+        <a:srgbClr val="551A8B"/>
       </a:folHlink>
     </a:clrScheme>
     <a:fontScheme name="Office">

</xml_diff>

<commit_message>
CBCT zamiast RTG: badanie 3D + kolejnosc fizykalne-then-CBCT u weryfikujacego
</commit_message>
<xml_diff>
--- a/dist/research-OC-dentysty.docx
+++ b/dist/research-OC-dentysty.docx
@@ -1,6 +1,6 @@
 
 <file path=word/document.xml><?xml version="1.0" encoding="utf-8"?>
-<w:document xmlns:o="urn:schemas-microsoft-com:office:office" xmlns:r="http://schemas.openxmlformats.org/officeDocument/2006/relationships" xmlns:v="urn:schemas-microsoft-com:vml" xmlns:w="http://schemas.openxmlformats.org/wordprocessingml/2006/main" xmlns:w10="urn:schemas-microsoft-com:office:word" xmlns:wp="http://schemas.openxmlformats.org/drawingml/2006/wordprocessingDrawing" xmlns:wps="http://schemas.microsoft.com/office/word/2010/wordprocessingShape" xmlns:wpg="http://schemas.microsoft.com/office/word/2010/wordprocessingGroup" xmlns:mc="http://schemas.openxmlformats.org/markup-compatibility/2006" xmlns:wp14="http://schemas.microsoft.com/office/word/2010/wordprocessingDrawing" xmlns:w14="http://schemas.microsoft.com/office/word/2010/wordml" xmlns:w15="http://schemas.microsoft.com/office/word/2012/wordml" mc:Ignorable="w14 wp14 w15">
+<w:document xmlns:o="urn:schemas-microsoft-com:office:office" xmlns:r="http://schemas.openxmlformats.org/officeDocument/2006/relationships" xmlns:v="urn:schemas-microsoft-com:vml" xmlns:w="http://schemas.openxmlformats.org/wordprocessingml/2006/main" xmlns:w10="urn:schemas-microsoft-com:office:word" xmlns:wp="http://schemas.openxmlformats.org/drawingml/2006/wordprocessingDrawing" xmlns:pic="http://schemas.openxmlformats.org/drawingml/2006/picture" xmlns:wps="http://schemas.microsoft.com/office/word/2010/wordprocessingShape" xmlns:wpg="http://schemas.microsoft.com/office/word/2010/wordprocessingGroup" xmlns:mc="http://schemas.openxmlformats.org/markup-compatibility/2006" xmlns:wp14="http://schemas.microsoft.com/office/word/2010/wordprocessingDrawing" xmlns:w14="http://schemas.microsoft.com/office/word/2010/wordml" xmlns:w15="http://schemas.microsoft.com/office/word/2012/wordml" mc:Ignorable="w14 wp14 w15">
   <w:body>
     <w:p>
       <w:pPr>
@@ -11,7 +11,7 @@
       </w:pPr>
       <w:r>
         <w:rPr/>
-        <w:t>Poradnik prawno-praktyczny: błąd diagnostyczny dentysty (zaniechanie na RTG) — OC, procedura, dokumenty</w:t>
+        <w:t>Poradnik prawno-praktyczny: błąd diagnostyczny dentysty (zaniechanie na tomografii CBCT) — OC, procedura, dokumenty</w:t>
       </w:r>
     </w:p>
     <w:p>
@@ -72,7 +72,17 @@
       </w:r>
       <w:r>
         <w:rPr/>
-        <w:t xml:space="preserve"> Wykonanie badania RTG (pantomogram / punktowe) u pierwszego dentysty — lekarz stwierdza brak zmian chorobowych i brak konieczności leczenia. </w:t>
+        <w:t xml:space="preserve"> Wykonanie tomografii stożkowej CBCT </w:t>
+      </w:r>
+      <w:r>
+        <w:rPr>
+          <w:rStyle w:val="Emphasis"/>
+        </w:rPr>
+        <w:t>(Cone Beam Computed Tomography — trójwymiarowe badanie obrazowe 3D, stosowane m.in. w stomatologii, chirurgii szczękowo-twarzowej, ortodoncji i implantologii)</w:t>
+      </w:r>
+      <w:r>
+        <w:rPr/>
+        <w:t xml:space="preserve"> u pierwszego dentysty — lekarz stwierdza brak zmian chorobowych i brak konieczności leczenia. </w:t>
       </w:r>
     </w:p>
     <w:p>
@@ -99,7 +109,7 @@
       </w:r>
       <w:r>
         <w:rPr/>
-        <w:t xml:space="preserve"> Kolejny lekarz dentysta w trakcie badania i ponownej oceny wcześniejszego zdjęcia RTG stwierdza, że zmiana chorobowa (np. zapalenie okołowierzchołkowe, głęboka próchnica, resorpcja) była widoczna już na pierwotnym zdjęciu RTG i powinna być leczona od razu. </w:t>
+        <w:t xml:space="preserve"> Kolejny lekarz dentysta najpierw wykonuje badanie fizykalne, a następnie własną tomografię CBCT; po wnikliwej analizie wcześniejszego badania CBCT stwierdza, że zmiana chorobowa (np. zapalenie okołowierzchołkowe, głęboka próchnica, resorpcja) była widoczna już w pierwotnym badaniu CBCT i powinna być leczona od razu. </w:t>
       </w:r>
     </w:p>
     <w:p>
@@ -152,7 +162,7 @@
       </w:r>
       <w:r>
         <w:rPr/>
-        <w:t xml:space="preserve"> Prawidłowe odczytanie RTG i wdrożenie leczenia w terminie pierwotnym zapobiegłoby rozwojowi powikłań, bólowi i znacząco obniżyłoby koszty. Zaniechanie diagnostyczno-terapeutyczne stanowi błąd w sztuce medycznej. </w:t>
+        <w:t xml:space="preserve"> Prawidłowe odczytanie CBCT i wdrożenie leczenia w terminie pierwotnym zapobiegłoby rozwojowi powikłań, bólowi i znacząco obniżyłoby koszty. Zaniechanie diagnostyczno-terapeutyczne stanowi błąd w sztuce medycznej. </w:t>
       </w:r>
     </w:p>
     <w:p>
@@ -239,7 +249,7 @@
       </w:r>
       <w:r>
         <w:rPr/>
-        <w:t xml:space="preserve"> ubezpieczonego w okresie trwania ochrony. Obejmuje błędy diagnostyczne (nieprawidłowy odczyt RTG), błędy terapeutyczne i opóźnienie leczenia. Ubezpieczyciel nie może umownie wyłączyć ustawowego zakresu ochrony. </w:t>
+        <w:t xml:space="preserve"> ubezpieczonego w okresie trwania ochrony. Obejmuje błędy diagnostyczne (nieprawidłowy odczyt CBCT), błędy terapeutyczne i opóźnienie leczenia. Ubezpieczyciel nie może umownie wyłączyć ustawowego zakresu ochrony. </w:t>
       </w:r>
     </w:p>
     <w:p>
@@ -738,7 +748,7 @@
       </w:r>
       <w:r>
         <w:rPr/>
-        <w:t xml:space="preserve"> Złożyć niezwłocznie wniosek o wydanie pełnej dokumentacji papierowej oraz cyfrowych plików RTG (format DICOM/oryginalny) do placówki, która wykonywała pierwotne badanie. </w:t>
+        <w:t xml:space="preserve"> Złożyć niezwłocznie wniosek o wydanie pełnej dokumentacji papierowej oraz cyfrowych plików CBCT (format DICOM/oryginalny) do placówki, która wykonywała pierwotne badanie. </w:t>
       </w:r>
     </w:p>
     <w:p>
@@ -904,7 +914,7 @@
       </w:pPr>
       <w:r>
         <w:rPr/>
-        <w:t xml:space="preserve">datę badania, </w:t>
+        <w:t xml:space="preserve">datę badania (fizykalnego i własnej tomografii CBCT), </w:t>
       </w:r>
     </w:p>
     <w:p>
@@ -925,7 +935,7 @@
       </w:pPr>
       <w:r>
         <w:rPr/>
-        <w:t xml:space="preserve">porównanie aktualnego stanu klinicznego z pierwotnym zdjęciem RTG, </w:t>
+        <w:t xml:space="preserve">porównanie aktualnego stanu klinicznego z pierwotnym badaniem CBCT, </w:t>
       </w:r>
     </w:p>
     <w:p>
@@ -946,7 +956,7 @@
       </w:pPr>
       <w:r>
         <w:rPr/>
-        <w:t xml:space="preserve">jednoznaczne stwierdzenie, że zmiana była widoczna na pierwotnym RTG i wymagała wdrożenia leczenia, </w:t>
+        <w:t xml:space="preserve">jednoznaczne stwierdzenie, że zmiana była widoczna w pierwotnym badaniu CBCT i wymagała wdrożenia leczenia, </w:t>
       </w:r>
     </w:p>
     <w:p>
@@ -1019,7 +1029,7 @@
       </w:pPr>
       <w:r>
         <w:rPr/>
-        <w:t xml:space="preserve">Dołączenie kompletu dowodów: chronologia, dokumentacja medyczna, płyta z RTG, opinia weryfikująca, kosztorys, faktury, zdjęcia obrzęku. </w:t>
+        <w:t xml:space="preserve">Dołączenie kompletu dowodów: chronologia, dokumentacja medyczna, nośnik z zapisem CBCT (DICOM), opinia weryfikująca, kosztorys, faktury, zdjęcia obrzęku. </w:t>
       </w:r>
     </w:p>
     <w:p>
@@ -2174,7 +2184,7 @@
       <w:start w:val="1"/>
       <w:numFmt w:val="none"/>
       <w:suff w:val="nothing"/>
-      <w:lvlText w:val="%1"/>
+      <w:lvlText w:val=""/>
       <w:lvlJc w:val="start"/>
       <w:pPr>
         <w:tabs>
@@ -2185,10 +2195,37 @@
     </w:lvl>
     <w:lvl w:ilvl="1">
       <w:start w:val="1"/>
+      <w:numFmt w:val="none"/>
       <w:pStyle w:val="Heading2"/>
+      <w:suff w:val="nothing"/>
+      <w:lvlText w:val=""/>
+      <w:lvlJc w:val="start"/>
+      <w:pPr>
+        <w:tabs>
+          <w:tab w:val="num" w:pos="0"/>
+        </w:tabs>
+        <w:ind w:start="0" w:hanging="0"/>
+      </w:pPr>
+    </w:lvl>
+    <w:lvl w:ilvl="2">
+      <w:start w:val="1"/>
+      <w:numFmt w:val="none"/>
+      <w:pStyle w:val="Heading3"/>
+      <w:suff w:val="nothing"/>
+      <w:lvlText w:val=""/>
+      <w:lvlJc w:val="start"/>
+      <w:pPr>
+        <w:tabs>
+          <w:tab w:val="num" w:pos="0"/>
+        </w:tabs>
+        <w:ind w:start="0" w:hanging="0"/>
+      </w:pPr>
+    </w:lvl>
+    <w:lvl w:ilvl="3">
+      <w:start w:val="1"/>
       <w:numFmt w:val="none"/>
       <w:suff w:val="nothing"/>
-      <w:lvlText w:val="%2"/>
+      <w:lvlText w:val=""/>
       <w:lvlJc w:val="start"/>
       <w:pPr>
         <w:tabs>
@@ -2197,12 +2234,11 @@
         <w:ind w:start="0" w:hanging="0"/>
       </w:pPr>
     </w:lvl>
-    <w:lvl w:ilvl="2">
-      <w:start w:val="1"/>
-      <w:pStyle w:val="Heading3"/>
+    <w:lvl w:ilvl="4">
+      <w:start w:val="1"/>
       <w:numFmt w:val="none"/>
       <w:suff w:val="nothing"/>
-      <w:lvlText w:val="%3"/>
+      <w:lvlText w:val=""/>
       <w:lvlJc w:val="start"/>
       <w:pPr>
         <w:tabs>
@@ -2211,11 +2247,11 @@
         <w:ind w:start="0" w:hanging="0"/>
       </w:pPr>
     </w:lvl>
-    <w:lvl w:ilvl="3">
+    <w:lvl w:ilvl="5">
       <w:start w:val="1"/>
       <w:numFmt w:val="none"/>
       <w:suff w:val="nothing"/>
-      <w:lvlText w:val="%4"/>
+      <w:lvlText w:val=""/>
       <w:lvlJc w:val="start"/>
       <w:pPr>
         <w:tabs>
@@ -2224,11 +2260,11 @@
         <w:ind w:start="0" w:hanging="0"/>
       </w:pPr>
     </w:lvl>
-    <w:lvl w:ilvl="4">
+    <w:lvl w:ilvl="6">
       <w:start w:val="1"/>
       <w:numFmt w:val="none"/>
       <w:suff w:val="nothing"/>
-      <w:lvlText w:val="%5"/>
+      <w:lvlText w:val=""/>
       <w:lvlJc w:val="start"/>
       <w:pPr>
         <w:tabs>
@@ -2237,11 +2273,11 @@
         <w:ind w:start="0" w:hanging="0"/>
       </w:pPr>
     </w:lvl>
-    <w:lvl w:ilvl="5">
+    <w:lvl w:ilvl="7">
       <w:start w:val="1"/>
       <w:numFmt w:val="none"/>
       <w:suff w:val="nothing"/>
-      <w:lvlText w:val="%6"/>
+      <w:lvlText w:val=""/>
       <w:lvlJc w:val="start"/>
       <w:pPr>
         <w:tabs>
@@ -2250,37 +2286,11 @@
         <w:ind w:start="0" w:hanging="0"/>
       </w:pPr>
     </w:lvl>
-    <w:lvl w:ilvl="6">
+    <w:lvl w:ilvl="8">
       <w:start w:val="1"/>
       <w:numFmt w:val="none"/>
       <w:suff w:val="nothing"/>
-      <w:lvlText w:val="%7"/>
-      <w:lvlJc w:val="start"/>
-      <w:pPr>
-        <w:tabs>
-          <w:tab w:val="num" w:pos="0"/>
-        </w:tabs>
-        <w:ind w:start="0" w:hanging="0"/>
-      </w:pPr>
-    </w:lvl>
-    <w:lvl w:ilvl="7">
-      <w:start w:val="1"/>
-      <w:numFmt w:val="none"/>
-      <w:suff w:val="nothing"/>
-      <w:lvlText w:val="%8"/>
-      <w:lvlJc w:val="start"/>
-      <w:pPr>
-        <w:tabs>
-          <w:tab w:val="num" w:pos="0"/>
-        </w:tabs>
-        <w:ind w:start="0" w:hanging="0"/>
-      </w:pPr>
-    </w:lvl>
-    <w:lvl w:ilvl="8">
-      <w:start w:val="1"/>
-      <w:numFmt w:val="none"/>
-      <w:suff w:val="nothing"/>
-      <w:lvlText w:val="%9"/>
+      <w:lvlText w:val=""/>
       <w:lvlJc w:val="start"/>
       <w:pPr>
         <w:tabs>
@@ -2325,10 +2335,10 @@
   <w:docDefaults>
     <w:rPrDefault>
       <w:rPr>
-        <w:rFonts w:ascii="Liberation Serif" w:hAnsi="Liberation Serif" w:eastAsia="Noto Sans" w:cs="Noto Sans Devanagari"/>
+        <w:rFonts w:ascii="Liberation Serif" w:hAnsi="Liberation Serif" w:eastAsia="Noto Serif CJK SC" w:cs="Noto Sans Devanagari"/>
         <w:sz w:val="24"/>
         <w:szCs w:val="24"/>
-        <w:lang w:val="en-US" w:eastAsia="zh-CN" w:bidi="hi-IN"/>
+        <w:lang w:val="pl-PL" w:eastAsia="zh-CN" w:bidi="hi-IN"/>
       </w:rPr>
     </w:rPrDefault>
     <w:pPrDefault>
@@ -2350,11 +2360,11 @@
       <w:color w:val="111111"/>
       <w:sz w:val="21"/>
       <w:szCs w:val="21"/>
-      <w:lang w:val="en-US" w:eastAsia="zh-CN" w:bidi="hi-IN"/>
+      <w:lang w:val="pl-PL" w:eastAsia="zh-CN" w:bidi="hi-IN"/>
     </w:rPr>
   </w:style>
   <w:style w:type="paragraph" w:styleId="Heading1">
-    <w:name w:val="Heading 1"/>
+    <w:name w:val="heading 1"/>
     <w:basedOn w:val="Heading"/>
     <w:next w:val="BodyText"/>
     <w:qFormat/>
@@ -2366,7 +2376,6 @@
       <w:jc w:val="center"/>
     </w:pPr>
     <w:rPr>
-      <w:rFonts w:ascii="Noto Sans" w:hAnsi="Noto Sans"/>
       <w:b/>
       <w:bCs/>
       <w:caps/>
@@ -2375,7 +2384,7 @@
     </w:rPr>
   </w:style>
   <w:style w:type="paragraph" w:styleId="Heading2">
-    <w:name w:val="Heading 2"/>
+    <w:name w:val="heading 2"/>
     <w:basedOn w:val="Heading"/>
     <w:next w:val="BodyText"/>
     <w:qFormat/>
@@ -2388,7 +2397,7 @@
       <w:outlineLvl w:val="1"/>
     </w:pPr>
     <w:rPr>
-      <w:rFonts w:ascii="Liberation Serif" w:hAnsi="Liberation Serif" w:eastAsia="Noto Sans" w:cs="Noto Sans Devanagari"/>
+      <w:rFonts w:ascii="Liberation Serif" w:hAnsi="Liberation Serif" w:eastAsia="Noto Serif CJK SC" w:cs="Noto Sans Devanagari"/>
       <w:b/>
       <w:bCs/>
       <w:sz w:val="24"/>
@@ -2396,7 +2405,7 @@
     </w:rPr>
   </w:style>
   <w:style w:type="paragraph" w:styleId="Heading3">
-    <w:name w:val="Heading 3"/>
+    <w:name w:val="heading 3"/>
     <w:basedOn w:val="Heading"/>
     <w:next w:val="BodyText"/>
     <w:qFormat/>
@@ -2406,11 +2415,23 @@
       <w:outlineLvl w:val="2"/>
     </w:pPr>
     <w:rPr>
-      <w:rFonts w:ascii="Liberation Serif" w:hAnsi="Liberation Serif" w:eastAsia="Noto Sans" w:cs="Noto Sans Devanagari"/>
+      <w:rFonts w:ascii="Liberation Serif" w:hAnsi="Liberation Serif" w:eastAsia="Noto Serif CJK SC" w:cs="Noto Sans Devanagari"/>
       <w:b/>
       <w:bCs/>
       <w:sz w:val="22"/>
       <w:szCs w:val="22"/>
+    </w:rPr>
+  </w:style>
+  <w:style w:type="character" w:styleId="EndnoteReference">
+    <w:name w:val="endnote reference"/>
+    <w:rPr>
+      <w:vertAlign w:val="superscript"/>
+    </w:rPr>
+  </w:style>
+  <w:style w:type="character" w:styleId="FootnoteReference">
+    <w:name w:val="footnote reference"/>
+    <w:rPr>
+      <w:vertAlign w:val="superscript"/>
     </w:rPr>
   </w:style>
   <w:style w:type="character" w:styleId="EndnoteCharacters">
@@ -2476,7 +2497,7 @@
     </w:rPr>
   </w:style>
   <w:style w:type="paragraph" w:styleId="EnvelopeReturn">
-    <w:name w:val="Envelope Return"/>
+    <w:name w:val="envelope return"/>
     <w:basedOn w:val="Normal"/>
     <w:pPr/>
     <w:rPr>
@@ -2488,46 +2509,6 @@
     <w:basedOn w:val="BodyText"/>
     <w:qFormat/>
     <w:pPr/>
-    <w:rPr/>
-  </w:style>
-  <w:style w:type="paragraph" w:styleId="Footer">
-    <w:name w:val="Footer"/>
-    <w:basedOn w:val="Normal"/>
-    <w:pPr>
-      <w:suppressLineNumbers/>
-      <w:tabs>
-        <w:tab w:val="clear" w:pos="1134"/>
-        <w:tab w:val="center" w:pos="4818" w:leader="none"/>
-        <w:tab w:val="right" w:pos="9637" w:leader="none"/>
-      </w:tabs>
-    </w:pPr>
-    <w:rPr/>
-  </w:style>
-  <w:style w:type="paragraph" w:styleId="Header">
-    <w:name w:val="Header"/>
-    <w:basedOn w:val="Normal"/>
-    <w:pPr>
-      <w:suppressLineNumbers/>
-      <w:tabs>
-        <w:tab w:val="clear" w:pos="1134"/>
-        <w:tab w:val="center" w:pos="4818" w:leader="none"/>
-        <w:tab w:val="right" w:pos="9637" w:leader="none"/>
-      </w:tabs>
-    </w:pPr>
-    <w:rPr/>
-  </w:style>
-  <w:style w:type="paragraph" w:styleId="HeaderandFooter">
-    <w:name w:val="Header and Footer"/>
-    <w:basedOn w:val="Normal"/>
-    <w:qFormat/>
-    <w:pPr>
-      <w:suppressLineNumbers/>
-      <w:tabs>
-        <w:tab w:val="clear" w:pos="1134"/>
-        <w:tab w:val="center" w:pos="4819" w:leader="none"/>
-        <w:tab w:val="right" w:pos="9638" w:leader="none"/>
-      </w:tabs>
-    </w:pPr>
     <w:rPr/>
   </w:style>
   <w:style w:type="paragraph" w:styleId="Index">
@@ -2542,7 +2523,7 @@
     </w:rPr>
   </w:style>
   <w:style w:type="paragraph" w:styleId="Caption">
-    <w:name w:val="Caption"/>
+    <w:name w:val="caption"/>
     <w:basedOn w:val="Normal"/>
     <w:qFormat/>
     <w:pPr>
@@ -2600,37 +2581,37 @@
         <a:srgbClr val="000000"/>
       </a:dk1>
       <a:lt1>
-        <a:srgbClr val="ffffff"/>
+        <a:srgbClr val="FFFFFF"/>
       </a:lt1>
       <a:dk2>
         <a:srgbClr val="000000"/>
       </a:dk2>
       <a:lt2>
-        <a:srgbClr val="ffffff"/>
+        <a:srgbClr val="FFFFFF"/>
       </a:lt2>
       <a:accent1>
-        <a:srgbClr val="18a303"/>
+        <a:srgbClr val="18A303"/>
       </a:accent1>
       <a:accent2>
-        <a:srgbClr val="0369a3"/>
+        <a:srgbClr val="0369A3"/>
       </a:accent2>
       <a:accent3>
-        <a:srgbClr val="a33e03"/>
+        <a:srgbClr val="A33E03"/>
       </a:accent3>
       <a:accent4>
-        <a:srgbClr val="8e03a3"/>
+        <a:srgbClr val="8E03A3"/>
       </a:accent4>
       <a:accent5>
-        <a:srgbClr val="c99c00"/>
+        <a:srgbClr val="C99C00"/>
       </a:accent5>
       <a:accent6>
-        <a:srgbClr val="c9211e"/>
+        <a:srgbClr val="C9211E"/>
       </a:accent6>
       <a:hlink>
-        <a:srgbClr val="0000ee"/>
+        <a:srgbClr val="0000EE"/>
       </a:hlink>
       <a:folHlink>
-        <a:srgbClr val="551a8b"/>
+        <a:srgbClr val="551A8B"/>
       </a:folHlink>
     </a:clrScheme>
     <a:fontScheme name="Office">

</xml_diff>

<commit_message>
Wariant nawrotu po leczeniu: sporna kontrola, DICOM vs DICOM, art. 362/430
</commit_message>
<xml_diff>
--- a/dist/research-OC-dentysty.docx
+++ b/dist/research-OC-dentysty.docx
@@ -1,6 +1,6 @@
 
 <file path=word/document.xml><?xml version="1.0" encoding="utf-8"?>
-<w:document xmlns:o="urn:schemas-microsoft-com:office:office" xmlns:r="http://schemas.openxmlformats.org/officeDocument/2006/relationships" xmlns:v="urn:schemas-microsoft-com:vml" xmlns:w="http://schemas.openxmlformats.org/wordprocessingml/2006/main" xmlns:w10="urn:schemas-microsoft-com:office:word" xmlns:wp="http://schemas.openxmlformats.org/drawingml/2006/wordprocessingDrawing" xmlns:wps="http://schemas.microsoft.com/office/word/2010/wordprocessingShape" xmlns:wpg="http://schemas.microsoft.com/office/word/2010/wordprocessingGroup" xmlns:mc="http://schemas.openxmlformats.org/markup-compatibility/2006" xmlns:wp14="http://schemas.microsoft.com/office/word/2010/wordprocessingDrawing" xmlns:w14="http://schemas.microsoft.com/office/word/2010/wordml" xmlns:w15="http://schemas.microsoft.com/office/word/2012/wordml" mc:Ignorable="w14 wp14 w15">
+<w:document xmlns:o="urn:schemas-microsoft-com:office:office" xmlns:r="http://schemas.openxmlformats.org/officeDocument/2006/relationships" xmlns:v="urn:schemas-microsoft-com:vml" xmlns:w="http://schemas.openxmlformats.org/wordprocessingml/2006/main" xmlns:w10="urn:schemas-microsoft-com:office:word" xmlns:wp="http://schemas.openxmlformats.org/drawingml/2006/wordprocessingDrawing" xmlns:pic="http://schemas.openxmlformats.org/drawingml/2006/picture" xmlns:wps="http://schemas.microsoft.com/office/word/2010/wordprocessingShape" xmlns:wpg="http://schemas.microsoft.com/office/word/2010/wordprocessingGroup" xmlns:mc="http://schemas.openxmlformats.org/markup-compatibility/2006" xmlns:wp14="http://schemas.microsoft.com/office/word/2010/wordprocessingDrawing" xmlns:w14="http://schemas.microsoft.com/office/word/2010/wordml" xmlns:w15="http://schemas.microsoft.com/office/word/2012/wordml" mc:Ignorable="w14 wp14 w15">
   <w:body>
     <w:p>
       <w:pPr>
@@ -68,7 +68,7 @@
         <w:rPr>
           <w:rStyle w:val="Strong"/>
         </w:rPr>
-        <w:t>Zdarzenie pierwotne:</w:t>
+        <w:t>Wariant A (pierwotne przeoczenie):</w:t>
       </w:r>
       <w:r>
         <w:rPr/>
@@ -105,11 +105,38 @@
         <w:rPr>
           <w:rStyle w:val="Strong"/>
         </w:rPr>
+        <w:t>Wariant B (nawrót po leczeniu / sporna kontrola — np. torbiel 11/12 po resekcji z 2021 r.):</w:t>
+      </w:r>
+      <w:r>
+        <w:rPr/>
+        <w:t xml:space="preserve"> Wcześniejsze skuteczne leczenie (resekcja + wyłuszczenie) i prawidłowe kontrole (np. CBCT z 2023 r.). Sporna kontrola CBCT (np. 04.08.2026) z ustnym „wszystko dobrze, kontrola za rok", bez wdrożenia leczenia. Krótko potem (np. 25.09.2026, ok. 7 tygodni) drugi lekarz stwierdza ropień i nawrót na własnym CBCT. Osią roszczenia jest sporna kontrola, nie leczenie pierwotne. </w:t>
+      </w:r>
+    </w:p>
+    <w:p>
+      <w:pPr>
+        <w:pStyle w:val="BodyText"/>
+        <w:numPr>
+          <w:ilvl w:val="0"/>
+          <w:numId w:val="1"/>
+        </w:numPr>
+        <w:tabs>
+          <w:tab w:val="clear" w:pos="1134"/>
+          <w:tab w:val="left" w:pos="709" w:leader="none"/>
+        </w:tabs>
+        <w:bidi w:val="0"/>
+        <w:spacing w:before="90" w:after="0"/>
+        <w:ind w:hanging="283" w:start="709"/>
+        <w:rPr/>
+      </w:pPr>
+      <w:r>
+        <w:rPr>
+          <w:rStyle w:val="Strong"/>
+        </w:rPr>
         <w:t>Wizyta weryfikacyjna / kontrolna:</w:t>
       </w:r>
       <w:r>
         <w:rPr/>
-        <w:t xml:space="preserve"> Kolejny lekarz dentysta najpierw wykonuje badanie fizykalne, a następnie własną tomografię CBCT; po wnikliwej analizie wcześniejszego badania CBCT stwierdza, że zmiana chorobowa (np. zapalenie okołowierzchołkowe, głęboka próchnica, resorpcja) była widoczna już w pierwotnym badaniu CBCT i powinna być leczona od razu. </w:t>
+        <w:t xml:space="preserve"> Kolejny lekarz dentysta najpierw wykonuje badanie fizykalne, a następnie własną tomografię CBCT; po wnikliwej analizie wcześniejszego (spornego) badania CBCT stwierdza, że zmiana chorobowa (np. zapalenie okołowierzchołkowe, głęboka próchnica, resorpcja, nawrót torbieli) była widoczna już w spornym badaniu CBCT i powinna być leczona od razu. Dowód kluczowy: pisemne porównanie DICOM obu badań CBCT. </w:t>
       </w:r>
     </w:p>
     <w:p>
@@ -515,6 +542,7 @@
           <w:tab w:val="left" w:pos="709" w:leader="none"/>
         </w:tabs>
         <w:bidi w:val="0"/>
+        <w:spacing w:before="90" w:after="0"/>
         <w:ind w:hanging="283" w:start="709"/>
         <w:rPr/>
       </w:pPr>
@@ -536,7 +564,60 @@
       </w:r>
       <w:r>
         <w:rPr/>
-        <w:t xml:space="preserve"> (art. 442¹ § 1 i § 3 KC). Momentem powzięcia wiedzy jest zazwyczaj data konsultacji weryfikacyjnej, a nie pierwotne błędne badanie. Zgodnie z art. 819 § 4 KC zgłoszenie ubezpieczycielowi roszczenia (lub zdarzenia) przerywa bieg przedawnienia roszczenia o świadczenie do ubezpieczyciela, a bieg rozpoczyna się na nowo od dnia otrzymania pisemnego oświadczenia ubezpieczyciela o przyznaniu lub odmowie świadczenia. </w:t>
+        <w:t xml:space="preserve"> (art. 442¹ § 1 i § 3 KC). Momentem powzięcia wiedzy jest zazwyczaj data konsultacji weryfikacyjnej, a nie pierwotne błędne badanie — w wariancie nawrotu liczy się data weryfikacji (np. 25.09.2026), nie data pierwotnego zabiegu (np. 2021). Zgodnie z art. 819 § 4 KC zgłoszenie ubezpieczycielowi roszczenia (lub zdarzenia) przerywa bieg przedawnienia roszczenia o świadczenie do ubezpieczyciela, a bieg rozpoczyna się na nowo od dnia otrzymania pisemnego oświadczenia ubezpieczyciela o przyznaniu lub odmowie świadczenia. </w:t>
+      </w:r>
+    </w:p>
+    <w:p>
+      <w:pPr>
+        <w:pStyle w:val="BodyText"/>
+        <w:numPr>
+          <w:ilvl w:val="0"/>
+          <w:numId w:val="2"/>
+        </w:numPr>
+        <w:tabs>
+          <w:tab w:val="clear" w:pos="1134"/>
+          <w:tab w:val="left" w:pos="709" w:leader="none"/>
+        </w:tabs>
+        <w:bidi w:val="0"/>
+        <w:spacing w:before="90" w:after="0"/>
+        <w:ind w:hanging="283" w:start="709"/>
+        <w:rPr/>
+      </w:pPr>
+      <w:r>
+        <w:rPr>
+          <w:rStyle w:val="Strong"/>
+        </w:rPr>
+        <w:t>Kto odpowiada (art. 430 KC):</w:t>
+      </w:r>
+      <w:r>
+        <w:rPr/>
+        <w:t xml:space="preserve"> Jeżeli lekarz na spornej kontroli (np. dr na kontroli 04.08.2026) działał jako personel placówki, odpowiada podmiot leczniczy jako zwierzchnik za winę personelu. Ustal to z karty wizyty / pieczątki. </w:t>
+      </w:r>
+    </w:p>
+    <w:p>
+      <w:pPr>
+        <w:pStyle w:val="BodyText"/>
+        <w:numPr>
+          <w:ilvl w:val="0"/>
+          <w:numId w:val="2"/>
+        </w:numPr>
+        <w:tabs>
+          <w:tab w:val="clear" w:pos="1134"/>
+          <w:tab w:val="left" w:pos="709" w:leader="none"/>
+        </w:tabs>
+        <w:bidi w:val="0"/>
+        <w:ind w:hanging="283" w:start="709"/>
+        <w:rPr/>
+      </w:pPr>
+      <w:r>
+        <w:rPr>
+          <w:rStyle w:val="Strong"/>
+        </w:rPr>
+        <w:t>Przyczynienie (art. 362 KC):</w:t>
+      </w:r>
+      <w:r>
+        <w:rPr/>
+        <w:t xml:space="preserve"> Jeżeli między objawami a sporną kontrolą była przerwa w zgłaszaniu się (np. objaw w kwietniu, wizyta dopiero w sierpniu), ubezpieczyciel może powołać się na przyczynienie i żądać miarkowania. Nie pomijaj tego faktu w chronologii — opisz jednym zdaniem zgodnie z prawdą; osią roszczenia pozostaje sporna kontrola. </w:t>
       </w:r>
     </w:p>
     <w:p>
@@ -748,7 +829,7 @@
       </w:r>
       <w:r>
         <w:rPr/>
-        <w:t xml:space="preserve"> Złożyć niezwłocznie wniosek o wydanie pełnej dokumentacji papierowej oraz cyfrowych plików CBCT (format DICOM/oryginalny) do placówki, która wykonywała pierwotne badanie. </w:t>
+        <w:t xml:space="preserve"> Złożyć niezwłocznie wniosek o wydanie pełnej dokumentacji papierowej oraz cyfrowych plików CBCT (format DICOM/oryginalny) do placówki, która wykonywała sporne badanie — a w wariancie nawrotu: pełna historia (zabieg + kontrole) + sporne CBCT + wpis z dnia spornej kontroli. Osobny wniosek do gabinetu weryfikującego o jego dokumentację. </w:t>
       </w:r>
     </w:p>
     <w:p>
@@ -935,7 +1016,7 @@
       </w:pPr>
       <w:r>
         <w:rPr/>
-        <w:t xml:space="preserve">porównanie aktualnego stanu klinicznego z pierwotnym badaniem CBCT, </w:t>
+        <w:t xml:space="preserve">porównanie aktualnego stanu klinicznego ze spornym badaniem CBCT (w wariancie nawrotu: DICOM sporny vs DICOM własny, z datami obu badań), </w:t>
       </w:r>
     </w:p>
     <w:p>
@@ -956,7 +1037,7 @@
       </w:pPr>
       <w:r>
         <w:rPr/>
-        <w:t xml:space="preserve">jednoznaczne stwierdzenie, że zmiana była widoczna w pierwotnym badaniu CBCT i wymagała wdrożenia leczenia, </w:t>
+        <w:t xml:space="preserve">jednoznaczne stwierdzenie, że zmiana była widoczna w spornym badaniu CBCT i wymagała wdrożenia leczenia, </w:t>
       </w:r>
     </w:p>
     <w:p>
@@ -2184,7 +2265,7 @@
       <w:start w:val="1"/>
       <w:numFmt w:val="none"/>
       <w:suff w:val="nothing"/>
-      <w:lvlText w:val="%1"/>
+      <w:lvlText w:val=""/>
       <w:lvlJc w:val="start"/>
       <w:pPr>
         <w:tabs>
@@ -2195,10 +2276,37 @@
     </w:lvl>
     <w:lvl w:ilvl="1">
       <w:start w:val="1"/>
+      <w:numFmt w:val="none"/>
       <w:pStyle w:val="Heading2"/>
+      <w:suff w:val="nothing"/>
+      <w:lvlText w:val=""/>
+      <w:lvlJc w:val="start"/>
+      <w:pPr>
+        <w:tabs>
+          <w:tab w:val="num" w:pos="0"/>
+        </w:tabs>
+        <w:ind w:start="0" w:hanging="0"/>
+      </w:pPr>
+    </w:lvl>
+    <w:lvl w:ilvl="2">
+      <w:start w:val="1"/>
+      <w:numFmt w:val="none"/>
+      <w:pStyle w:val="Heading3"/>
+      <w:suff w:val="nothing"/>
+      <w:lvlText w:val=""/>
+      <w:lvlJc w:val="start"/>
+      <w:pPr>
+        <w:tabs>
+          <w:tab w:val="num" w:pos="0"/>
+        </w:tabs>
+        <w:ind w:start="0" w:hanging="0"/>
+      </w:pPr>
+    </w:lvl>
+    <w:lvl w:ilvl="3">
+      <w:start w:val="1"/>
       <w:numFmt w:val="none"/>
       <w:suff w:val="nothing"/>
-      <w:lvlText w:val="%2"/>
+      <w:lvlText w:val=""/>
       <w:lvlJc w:val="start"/>
       <w:pPr>
         <w:tabs>
@@ -2207,12 +2315,11 @@
         <w:ind w:start="0" w:hanging="0"/>
       </w:pPr>
     </w:lvl>
-    <w:lvl w:ilvl="2">
-      <w:start w:val="1"/>
-      <w:pStyle w:val="Heading3"/>
+    <w:lvl w:ilvl="4">
+      <w:start w:val="1"/>
       <w:numFmt w:val="none"/>
       <w:suff w:val="nothing"/>
-      <w:lvlText w:val="%3"/>
+      <w:lvlText w:val=""/>
       <w:lvlJc w:val="start"/>
       <w:pPr>
         <w:tabs>
@@ -2221,11 +2328,11 @@
         <w:ind w:start="0" w:hanging="0"/>
       </w:pPr>
     </w:lvl>
-    <w:lvl w:ilvl="3">
+    <w:lvl w:ilvl="5">
       <w:start w:val="1"/>
       <w:numFmt w:val="none"/>
       <w:suff w:val="nothing"/>
-      <w:lvlText w:val="%4"/>
+      <w:lvlText w:val=""/>
       <w:lvlJc w:val="start"/>
       <w:pPr>
         <w:tabs>
@@ -2234,11 +2341,11 @@
         <w:ind w:start="0" w:hanging="0"/>
       </w:pPr>
     </w:lvl>
-    <w:lvl w:ilvl="4">
+    <w:lvl w:ilvl="6">
       <w:start w:val="1"/>
       <w:numFmt w:val="none"/>
       <w:suff w:val="nothing"/>
-      <w:lvlText w:val="%5"/>
+      <w:lvlText w:val=""/>
       <w:lvlJc w:val="start"/>
       <w:pPr>
         <w:tabs>
@@ -2247,11 +2354,11 @@
         <w:ind w:start="0" w:hanging="0"/>
       </w:pPr>
     </w:lvl>
-    <w:lvl w:ilvl="5">
+    <w:lvl w:ilvl="7">
       <w:start w:val="1"/>
       <w:numFmt w:val="none"/>
       <w:suff w:val="nothing"/>
-      <w:lvlText w:val="%6"/>
+      <w:lvlText w:val=""/>
       <w:lvlJc w:val="start"/>
       <w:pPr>
         <w:tabs>
@@ -2260,37 +2367,11 @@
         <w:ind w:start="0" w:hanging="0"/>
       </w:pPr>
     </w:lvl>
-    <w:lvl w:ilvl="6">
+    <w:lvl w:ilvl="8">
       <w:start w:val="1"/>
       <w:numFmt w:val="none"/>
       <w:suff w:val="nothing"/>
-      <w:lvlText w:val="%7"/>
-      <w:lvlJc w:val="start"/>
-      <w:pPr>
-        <w:tabs>
-          <w:tab w:val="num" w:pos="0"/>
-        </w:tabs>
-        <w:ind w:start="0" w:hanging="0"/>
-      </w:pPr>
-    </w:lvl>
-    <w:lvl w:ilvl="7">
-      <w:start w:val="1"/>
-      <w:numFmt w:val="none"/>
-      <w:suff w:val="nothing"/>
-      <w:lvlText w:val="%8"/>
-      <w:lvlJc w:val="start"/>
-      <w:pPr>
-        <w:tabs>
-          <w:tab w:val="num" w:pos="0"/>
-        </w:tabs>
-        <w:ind w:start="0" w:hanging="0"/>
-      </w:pPr>
-    </w:lvl>
-    <w:lvl w:ilvl="8">
-      <w:start w:val="1"/>
-      <w:numFmt w:val="none"/>
-      <w:suff w:val="nothing"/>
-      <w:lvlText w:val="%9"/>
+      <w:lvlText w:val=""/>
       <w:lvlJc w:val="start"/>
       <w:pPr>
         <w:tabs>
@@ -2335,10 +2416,10 @@
   <w:docDefaults>
     <w:rPrDefault>
       <w:rPr>
-        <w:rFonts w:ascii="Liberation Serif" w:hAnsi="Liberation Serif" w:eastAsia="Noto Sans" w:cs="Noto Sans Devanagari"/>
+        <w:rFonts w:ascii="Liberation Serif" w:hAnsi="Liberation Serif" w:eastAsia="Noto Serif CJK SC" w:cs="Noto Sans Devanagari"/>
         <w:sz w:val="24"/>
         <w:szCs w:val="24"/>
-        <w:lang w:val="en-US" w:eastAsia="zh-CN" w:bidi="hi-IN"/>
+        <w:lang w:val="pl-PL" w:eastAsia="zh-CN" w:bidi="hi-IN"/>
       </w:rPr>
     </w:rPrDefault>
     <w:pPrDefault>
@@ -2360,11 +2441,11 @@
       <w:color w:val="111111"/>
       <w:sz w:val="21"/>
       <w:szCs w:val="21"/>
-      <w:lang w:val="en-US" w:eastAsia="zh-CN" w:bidi="hi-IN"/>
+      <w:lang w:val="pl-PL" w:eastAsia="zh-CN" w:bidi="hi-IN"/>
     </w:rPr>
   </w:style>
   <w:style w:type="paragraph" w:styleId="Heading1">
-    <w:name w:val="Heading 1"/>
+    <w:name w:val="heading 1"/>
     <w:basedOn w:val="Heading"/>
     <w:next w:val="BodyText"/>
     <w:qFormat/>
@@ -2376,7 +2457,6 @@
       <w:jc w:val="center"/>
     </w:pPr>
     <w:rPr>
-      <w:rFonts w:ascii="Noto Sans" w:hAnsi="Noto Sans"/>
       <w:b/>
       <w:bCs/>
       <w:caps/>
@@ -2385,7 +2465,7 @@
     </w:rPr>
   </w:style>
   <w:style w:type="paragraph" w:styleId="Heading2">
-    <w:name w:val="Heading 2"/>
+    <w:name w:val="heading 2"/>
     <w:basedOn w:val="Heading"/>
     <w:next w:val="BodyText"/>
     <w:qFormat/>
@@ -2398,7 +2478,7 @@
       <w:outlineLvl w:val="1"/>
     </w:pPr>
     <w:rPr>
-      <w:rFonts w:ascii="Liberation Serif" w:hAnsi="Liberation Serif" w:eastAsia="Noto Sans" w:cs="Noto Sans Devanagari"/>
+      <w:rFonts w:ascii="Liberation Serif" w:hAnsi="Liberation Serif" w:eastAsia="Noto Serif CJK SC" w:cs="Noto Sans Devanagari"/>
       <w:b/>
       <w:bCs/>
       <w:sz w:val="24"/>
@@ -2406,7 +2486,7 @@
     </w:rPr>
   </w:style>
   <w:style w:type="paragraph" w:styleId="Heading3">
-    <w:name w:val="Heading 3"/>
+    <w:name w:val="heading 3"/>
     <w:basedOn w:val="Heading"/>
     <w:next w:val="BodyText"/>
     <w:qFormat/>
@@ -2416,11 +2496,23 @@
       <w:outlineLvl w:val="2"/>
     </w:pPr>
     <w:rPr>
-      <w:rFonts w:ascii="Liberation Serif" w:hAnsi="Liberation Serif" w:eastAsia="Noto Sans" w:cs="Noto Sans Devanagari"/>
+      <w:rFonts w:ascii="Liberation Serif" w:hAnsi="Liberation Serif" w:eastAsia="Noto Serif CJK SC" w:cs="Noto Sans Devanagari"/>
       <w:b/>
       <w:bCs/>
       <w:sz w:val="22"/>
       <w:szCs w:val="22"/>
+    </w:rPr>
+  </w:style>
+  <w:style w:type="character" w:styleId="EndnoteReference">
+    <w:name w:val="endnote reference"/>
+    <w:rPr>
+      <w:vertAlign w:val="superscript"/>
+    </w:rPr>
+  </w:style>
+  <w:style w:type="character" w:styleId="FootnoteReference">
+    <w:name w:val="footnote reference"/>
+    <w:rPr>
+      <w:vertAlign w:val="superscript"/>
     </w:rPr>
   </w:style>
   <w:style w:type="character" w:styleId="EndnoteCharacters">
@@ -2486,7 +2578,7 @@
     </w:rPr>
   </w:style>
   <w:style w:type="paragraph" w:styleId="EnvelopeReturn">
-    <w:name w:val="Envelope Return"/>
+    <w:name w:val="envelope return"/>
     <w:basedOn w:val="Normal"/>
     <w:pPr/>
     <w:rPr>
@@ -2498,46 +2590,6 @@
     <w:basedOn w:val="BodyText"/>
     <w:qFormat/>
     <w:pPr/>
-    <w:rPr/>
-  </w:style>
-  <w:style w:type="paragraph" w:styleId="Footer">
-    <w:name w:val="Footer"/>
-    <w:basedOn w:val="Normal"/>
-    <w:pPr>
-      <w:suppressLineNumbers/>
-      <w:tabs>
-        <w:tab w:val="clear" w:pos="1134"/>
-        <w:tab w:val="center" w:pos="4818" w:leader="none"/>
-        <w:tab w:val="right" w:pos="9637" w:leader="none"/>
-      </w:tabs>
-    </w:pPr>
-    <w:rPr/>
-  </w:style>
-  <w:style w:type="paragraph" w:styleId="Header">
-    <w:name w:val="Header"/>
-    <w:basedOn w:val="Normal"/>
-    <w:pPr>
-      <w:suppressLineNumbers/>
-      <w:tabs>
-        <w:tab w:val="clear" w:pos="1134"/>
-        <w:tab w:val="center" w:pos="4818" w:leader="none"/>
-        <w:tab w:val="right" w:pos="9637" w:leader="none"/>
-      </w:tabs>
-    </w:pPr>
-    <w:rPr/>
-  </w:style>
-  <w:style w:type="paragraph" w:styleId="HeaderandFooter">
-    <w:name w:val="Header and Footer"/>
-    <w:basedOn w:val="Normal"/>
-    <w:qFormat/>
-    <w:pPr>
-      <w:suppressLineNumbers/>
-      <w:tabs>
-        <w:tab w:val="clear" w:pos="1134"/>
-        <w:tab w:val="center" w:pos="4819" w:leader="none"/>
-        <w:tab w:val="right" w:pos="9638" w:leader="none"/>
-      </w:tabs>
-    </w:pPr>
     <w:rPr/>
   </w:style>
   <w:style w:type="paragraph" w:styleId="Index">
@@ -2552,7 +2604,7 @@
     </w:rPr>
   </w:style>
   <w:style w:type="paragraph" w:styleId="Caption">
-    <w:name w:val="Caption"/>
+    <w:name w:val="caption"/>
     <w:basedOn w:val="Normal"/>
     <w:qFormat/>
     <w:pPr>
@@ -2610,37 +2662,37 @@
         <a:srgbClr val="000000"/>
       </a:dk1>
       <a:lt1>
-        <a:srgbClr val="ffffff"/>
+        <a:srgbClr val="FFFFFF"/>
       </a:lt1>
       <a:dk2>
         <a:srgbClr val="000000"/>
       </a:dk2>
       <a:lt2>
-        <a:srgbClr val="ffffff"/>
+        <a:srgbClr val="FFFFFF"/>
       </a:lt2>
       <a:accent1>
-        <a:srgbClr val="18a303"/>
+        <a:srgbClr val="18A303"/>
       </a:accent1>
       <a:accent2>
-        <a:srgbClr val="0369a3"/>
+        <a:srgbClr val="0369A3"/>
       </a:accent2>
       <a:accent3>
-        <a:srgbClr val="a33e03"/>
+        <a:srgbClr val="A33E03"/>
       </a:accent3>
       <a:accent4>
-        <a:srgbClr val="8e03a3"/>
+        <a:srgbClr val="8E03A3"/>
       </a:accent4>
       <a:accent5>
-        <a:srgbClr val="c99c00"/>
+        <a:srgbClr val="C99C00"/>
       </a:accent5>
       <a:accent6>
-        <a:srgbClr val="c9211e"/>
+        <a:srgbClr val="C9211E"/>
       </a:accent6>
       <a:hlink>
-        <a:srgbClr val="0000ee"/>
+        <a:srgbClr val="0000EE"/>
       </a:hlink>
       <a:folHlink>
-        <a:srgbClr val="551a8b"/>
+        <a:srgbClr val="551A8B"/>
       </a:folHlink>
     </a:clrScheme>
     <a:fontScheme name="Office">

</xml_diff>

<commit_message>
Popraw publikację stron HTML dla pacjentki
</commit_message>
<xml_diff>
--- a/dist/research-OC-dentysty.docx
+++ b/dist/research-OC-dentysty.docx
@@ -1,6 +1,6 @@
 
 <file path=word/document.xml><?xml version="1.0" encoding="utf-8"?>
-<w:document xmlns:o="urn:schemas-microsoft-com:office:office" xmlns:r="http://schemas.openxmlformats.org/officeDocument/2006/relationships" xmlns:v="urn:schemas-microsoft-com:vml" xmlns:w="http://schemas.openxmlformats.org/wordprocessingml/2006/main" xmlns:w10="urn:schemas-microsoft-com:office:word" xmlns:wp="http://schemas.openxmlformats.org/drawingml/2006/wordprocessingDrawing" xmlns:wps="http://schemas.microsoft.com/office/word/2010/wordprocessingShape" xmlns:wpg="http://schemas.microsoft.com/office/word/2010/wordprocessingGroup" xmlns:mc="http://schemas.openxmlformats.org/markup-compatibility/2006" xmlns:wp14="http://schemas.microsoft.com/office/word/2010/wordprocessingDrawing" xmlns:w14="http://schemas.microsoft.com/office/word/2010/wordml" xmlns:w15="http://schemas.microsoft.com/office/word/2012/wordml" mc:Ignorable="w14 wp14 w15">
+<w:document xmlns:o="urn:schemas-microsoft-com:office:office" xmlns:r="http://schemas.openxmlformats.org/officeDocument/2006/relationships" xmlns:v="urn:schemas-microsoft-com:vml" xmlns:w="http://schemas.openxmlformats.org/wordprocessingml/2006/main" xmlns:w10="urn:schemas-microsoft-com:office:word" xmlns:wp="http://schemas.openxmlformats.org/drawingml/2006/wordprocessingDrawing" xmlns:pic="http://schemas.openxmlformats.org/drawingml/2006/picture" xmlns:wps="http://schemas.microsoft.com/office/word/2010/wordprocessingShape" xmlns:wpg="http://schemas.microsoft.com/office/word/2010/wordprocessingGroup" xmlns:mc="http://schemas.openxmlformats.org/markup-compatibility/2006" xmlns:wp14="http://schemas.microsoft.com/office/word/2010/wordprocessingDrawing" xmlns:w14="http://schemas.microsoft.com/office/word/2010/wordml" xmlns:w15="http://schemas.microsoft.com/office/word/2012/wordml" mc:Ignorable="w14 wp14 w15">
   <w:body>
     <w:p>
       <w:pPr>
@@ -1548,7 +1548,7 @@
       <w:start w:val="1"/>
       <w:numFmt w:val="none"/>
       <w:suff w:val="nothing"/>
-      <w:lvlText w:val="%1"/>
+      <w:lvlText w:val=""/>
       <w:lvlJc w:val="start"/>
       <w:pPr>
         <w:tabs>
@@ -1559,10 +1559,37 @@
     </w:lvl>
     <w:lvl w:ilvl="1">
       <w:start w:val="1"/>
+      <w:numFmt w:val="none"/>
       <w:pStyle w:val="Heading2"/>
+      <w:suff w:val="nothing"/>
+      <w:lvlText w:val=""/>
+      <w:lvlJc w:val="start"/>
+      <w:pPr>
+        <w:tabs>
+          <w:tab w:val="num" w:pos="0"/>
+        </w:tabs>
+        <w:ind w:start="0" w:hanging="0"/>
+      </w:pPr>
+    </w:lvl>
+    <w:lvl w:ilvl="2">
+      <w:start w:val="1"/>
+      <w:numFmt w:val="none"/>
+      <w:pStyle w:val="Heading3"/>
+      <w:suff w:val="nothing"/>
+      <w:lvlText w:val=""/>
+      <w:lvlJc w:val="start"/>
+      <w:pPr>
+        <w:tabs>
+          <w:tab w:val="num" w:pos="0"/>
+        </w:tabs>
+        <w:ind w:start="0" w:hanging="0"/>
+      </w:pPr>
+    </w:lvl>
+    <w:lvl w:ilvl="3">
+      <w:start w:val="1"/>
       <w:numFmt w:val="none"/>
       <w:suff w:val="nothing"/>
-      <w:lvlText w:val="%2"/>
+      <w:lvlText w:val=""/>
       <w:lvlJc w:val="start"/>
       <w:pPr>
         <w:tabs>
@@ -1571,12 +1598,11 @@
         <w:ind w:start="0" w:hanging="0"/>
       </w:pPr>
     </w:lvl>
-    <w:lvl w:ilvl="2">
-      <w:start w:val="1"/>
-      <w:pStyle w:val="Heading3"/>
+    <w:lvl w:ilvl="4">
+      <w:start w:val="1"/>
       <w:numFmt w:val="none"/>
       <w:suff w:val="nothing"/>
-      <w:lvlText w:val="%3"/>
+      <w:lvlText w:val=""/>
       <w:lvlJc w:val="start"/>
       <w:pPr>
         <w:tabs>
@@ -1585,11 +1611,11 @@
         <w:ind w:start="0" w:hanging="0"/>
       </w:pPr>
     </w:lvl>
-    <w:lvl w:ilvl="3">
+    <w:lvl w:ilvl="5">
       <w:start w:val="1"/>
       <w:numFmt w:val="none"/>
       <w:suff w:val="nothing"/>
-      <w:lvlText w:val="%4"/>
+      <w:lvlText w:val=""/>
       <w:lvlJc w:val="start"/>
       <w:pPr>
         <w:tabs>
@@ -1598,11 +1624,11 @@
         <w:ind w:start="0" w:hanging="0"/>
       </w:pPr>
     </w:lvl>
-    <w:lvl w:ilvl="4">
+    <w:lvl w:ilvl="6">
       <w:start w:val="1"/>
       <w:numFmt w:val="none"/>
       <w:suff w:val="nothing"/>
-      <w:lvlText w:val="%5"/>
+      <w:lvlText w:val=""/>
       <w:lvlJc w:val="start"/>
       <w:pPr>
         <w:tabs>
@@ -1611,11 +1637,11 @@
         <w:ind w:start="0" w:hanging="0"/>
       </w:pPr>
     </w:lvl>
-    <w:lvl w:ilvl="5">
+    <w:lvl w:ilvl="7">
       <w:start w:val="1"/>
       <w:numFmt w:val="none"/>
       <w:suff w:val="nothing"/>
-      <w:lvlText w:val="%6"/>
+      <w:lvlText w:val=""/>
       <w:lvlJc w:val="start"/>
       <w:pPr>
         <w:tabs>
@@ -1624,37 +1650,11 @@
         <w:ind w:start="0" w:hanging="0"/>
       </w:pPr>
     </w:lvl>
-    <w:lvl w:ilvl="6">
+    <w:lvl w:ilvl="8">
       <w:start w:val="1"/>
       <w:numFmt w:val="none"/>
       <w:suff w:val="nothing"/>
-      <w:lvlText w:val="%7"/>
-      <w:lvlJc w:val="start"/>
-      <w:pPr>
-        <w:tabs>
-          <w:tab w:val="num" w:pos="0"/>
-        </w:tabs>
-        <w:ind w:start="0" w:hanging="0"/>
-      </w:pPr>
-    </w:lvl>
-    <w:lvl w:ilvl="7">
-      <w:start w:val="1"/>
-      <w:numFmt w:val="none"/>
-      <w:suff w:val="nothing"/>
-      <w:lvlText w:val="%8"/>
-      <w:lvlJc w:val="start"/>
-      <w:pPr>
-        <w:tabs>
-          <w:tab w:val="num" w:pos="0"/>
-        </w:tabs>
-        <w:ind w:start="0" w:hanging="0"/>
-      </w:pPr>
-    </w:lvl>
-    <w:lvl w:ilvl="8">
-      <w:start w:val="1"/>
-      <w:numFmt w:val="none"/>
-      <w:suff w:val="nothing"/>
-      <w:lvlText w:val="%9"/>
+      <w:lvlText w:val=""/>
       <w:lvlJc w:val="start"/>
       <w:pPr>
         <w:tabs>
@@ -1690,7 +1690,7 @@
   <w:docDefaults>
     <w:rPrDefault>
       <w:rPr>
-        <w:rFonts w:ascii="Liberation Serif" w:hAnsi="Liberation Serif" w:eastAsia="Noto Sans" w:cs="Noto Sans Devanagari"/>
+        <w:rFonts w:ascii="Liberation Serif" w:hAnsi="Liberation Serif" w:eastAsia="Noto Serif CJK SC" w:cs="Noto Sans Devanagari"/>
         <w:sz w:val="24"/>
         <w:szCs w:val="24"/>
         <w:lang w:val="en-US" w:eastAsia="zh-CN" w:bidi="hi-IN"/>
@@ -1719,7 +1719,7 @@
     </w:rPr>
   </w:style>
   <w:style w:type="paragraph" w:styleId="Heading1">
-    <w:name w:val="Heading 1"/>
+    <w:name w:val="heading 1"/>
     <w:basedOn w:val="Heading"/>
     <w:next w:val="BodyText"/>
     <w:qFormat/>
@@ -1731,7 +1731,6 @@
       <w:jc w:val="center"/>
     </w:pPr>
     <w:rPr>
-      <w:rFonts w:ascii="Noto Sans" w:hAnsi="Noto Sans"/>
       <w:b/>
       <w:bCs/>
       <w:caps/>
@@ -1740,7 +1739,7 @@
     </w:rPr>
   </w:style>
   <w:style w:type="paragraph" w:styleId="Heading2">
-    <w:name w:val="Heading 2"/>
+    <w:name w:val="heading 2"/>
     <w:basedOn w:val="Heading"/>
     <w:next w:val="BodyText"/>
     <w:qFormat/>
@@ -1753,7 +1752,7 @@
       <w:outlineLvl w:val="1"/>
     </w:pPr>
     <w:rPr>
-      <w:rFonts w:ascii="Liberation Serif" w:hAnsi="Liberation Serif" w:eastAsia="Noto Sans" w:cs="Noto Sans Devanagari"/>
+      <w:rFonts w:ascii="Liberation Serif" w:hAnsi="Liberation Serif" w:eastAsia="Noto Serif CJK SC" w:cs="Noto Sans Devanagari"/>
       <w:b/>
       <w:bCs/>
       <w:sz w:val="24"/>
@@ -1761,7 +1760,7 @@
     </w:rPr>
   </w:style>
   <w:style w:type="paragraph" w:styleId="Heading3">
-    <w:name w:val="Heading 3"/>
+    <w:name w:val="heading 3"/>
     <w:basedOn w:val="Heading"/>
     <w:next w:val="BodyText"/>
     <w:qFormat/>
@@ -1771,11 +1770,23 @@
       <w:outlineLvl w:val="2"/>
     </w:pPr>
     <w:rPr>
-      <w:rFonts w:ascii="Liberation Serif" w:hAnsi="Liberation Serif" w:eastAsia="Noto Sans" w:cs="Noto Sans Devanagari"/>
+      <w:rFonts w:ascii="Liberation Serif" w:hAnsi="Liberation Serif" w:eastAsia="Noto Serif CJK SC" w:cs="Noto Sans Devanagari"/>
       <w:b/>
       <w:bCs/>
       <w:sz w:val="22"/>
       <w:szCs w:val="22"/>
+    </w:rPr>
+  </w:style>
+  <w:style w:type="character" w:styleId="EndnoteReference">
+    <w:name w:val="endnote reference"/>
+    <w:rPr>
+      <w:vertAlign w:val="superscript"/>
+    </w:rPr>
+  </w:style>
+  <w:style w:type="character" w:styleId="FootnoteReference">
+    <w:name w:val="footnote reference"/>
+    <w:rPr>
+      <w:vertAlign w:val="superscript"/>
     </w:rPr>
   </w:style>
   <w:style w:type="character" w:styleId="EndnoteCharacters">
@@ -1841,7 +1852,7 @@
     </w:rPr>
   </w:style>
   <w:style w:type="paragraph" w:styleId="EnvelopeReturn">
-    <w:name w:val="Envelope Return"/>
+    <w:name w:val="envelope return"/>
     <w:basedOn w:val="Normal"/>
     <w:pPr/>
     <w:rPr>
@@ -1853,46 +1864,6 @@
     <w:basedOn w:val="BodyText"/>
     <w:qFormat/>
     <w:pPr/>
-    <w:rPr/>
-  </w:style>
-  <w:style w:type="paragraph" w:styleId="Footer">
-    <w:name w:val="Footer"/>
-    <w:basedOn w:val="Normal"/>
-    <w:pPr>
-      <w:suppressLineNumbers/>
-      <w:tabs>
-        <w:tab w:val="clear" w:pos="1134"/>
-        <w:tab w:val="center" w:pos="4818" w:leader="none"/>
-        <w:tab w:val="right" w:pos="9637" w:leader="none"/>
-      </w:tabs>
-    </w:pPr>
-    <w:rPr/>
-  </w:style>
-  <w:style w:type="paragraph" w:styleId="Header">
-    <w:name w:val="Header"/>
-    <w:basedOn w:val="Normal"/>
-    <w:pPr>
-      <w:suppressLineNumbers/>
-      <w:tabs>
-        <w:tab w:val="clear" w:pos="1134"/>
-        <w:tab w:val="center" w:pos="4818" w:leader="none"/>
-        <w:tab w:val="right" w:pos="9637" w:leader="none"/>
-      </w:tabs>
-    </w:pPr>
-    <w:rPr/>
-  </w:style>
-  <w:style w:type="paragraph" w:styleId="HeaderandFooter">
-    <w:name w:val="Header and Footer"/>
-    <w:basedOn w:val="Normal"/>
-    <w:qFormat/>
-    <w:pPr>
-      <w:suppressLineNumbers/>
-      <w:tabs>
-        <w:tab w:val="clear" w:pos="1134"/>
-        <w:tab w:val="center" w:pos="4819" w:leader="none"/>
-        <w:tab w:val="right" w:pos="9638" w:leader="none"/>
-      </w:tabs>
-    </w:pPr>
     <w:rPr/>
   </w:style>
   <w:style w:type="paragraph" w:styleId="Index">
@@ -1907,7 +1878,7 @@
     </w:rPr>
   </w:style>
   <w:style w:type="paragraph" w:styleId="Caption">
-    <w:name w:val="Caption"/>
+    <w:name w:val="caption"/>
     <w:basedOn w:val="Normal"/>
     <w:qFormat/>
     <w:pPr>
@@ -1965,37 +1936,37 @@
         <a:srgbClr val="000000"/>
       </a:dk1>
       <a:lt1>
-        <a:srgbClr val="ffffff"/>
+        <a:srgbClr val="FFFFFF"/>
       </a:lt1>
       <a:dk2>
         <a:srgbClr val="000000"/>
       </a:dk2>
       <a:lt2>
-        <a:srgbClr val="ffffff"/>
+        <a:srgbClr val="FFFFFF"/>
       </a:lt2>
       <a:accent1>
-        <a:srgbClr val="18a303"/>
+        <a:srgbClr val="18A303"/>
       </a:accent1>
       <a:accent2>
-        <a:srgbClr val="0369a3"/>
+        <a:srgbClr val="0369A3"/>
       </a:accent2>
       <a:accent3>
-        <a:srgbClr val="a33e03"/>
+        <a:srgbClr val="A33E03"/>
       </a:accent3>
       <a:accent4>
-        <a:srgbClr val="8e03a3"/>
+        <a:srgbClr val="8E03A3"/>
       </a:accent4>
       <a:accent5>
-        <a:srgbClr val="c99c00"/>
+        <a:srgbClr val="C99C00"/>
       </a:accent5>
       <a:accent6>
-        <a:srgbClr val="c9211e"/>
+        <a:srgbClr val="C9211E"/>
       </a:accent6>
       <a:hlink>
-        <a:srgbClr val="0000ee"/>
+        <a:srgbClr val="0000EE"/>
       </a:hlink>
       <a:folHlink>
-        <a:srgbClr val="551a8b"/>
+        <a:srgbClr val="551A8B"/>
       </a:folHlink>
     </a:clrScheme>
     <a:fontScheme name="Office">

</xml_diff>